<commit_message>
feat: fix input after PO demo regarding information note #BKDO-1032
</commit_message>
<xml_diff>
--- a/src/Bk.APG.Api/Templates/InformationNote_German.docx
+++ b/src/Bk.APG.Api/Templates/InformationNote_German.docx
@@ -5931,23 +5931,21 @@
     </w:p>
     <w:p>
       <w:pPr>
-        <w:rPr>
-          <w:rFonts w:cs="Arial"/>
-        </w:rPr>
-      </w:pPr>
-      <w:r>
-        <w:rPr>
-          <w:rFonts w:cs="Arial"/>
+        <w:spacing w:after="120"/>
+        <w:rPr>
+          <w:rFonts w:cs="Arial"/>
+          <w:u w:val="single"/>
+          <w:lang w:eastAsia="de-DE"/>
+        </w:rPr>
+      </w:pPr>
+      <w:r>
+        <w:rPr>
+          <w:rFonts w:cs="Arial"/>
+          <w:u w:val="single"/>
+          <w:lang w:eastAsia="de-DE"/>
         </w:rPr>
         <w:t>Vertretungen des Bundes</w:t>
       </w:r>
-    </w:p>
-    <w:p>
-      <w:pPr>
-        <w:rPr>
-          <w:rFonts w:cs="Arial"/>
-        </w:rPr>
-      </w:pPr>
     </w:p>
     <w:tbl>
       <w:tblPr>
@@ -10301,7 +10299,47 @@
           <w:sz w:val="16"/>
           <w:szCs w:val="16"/>
         </w:rPr>
-        <w:t>Nicht berücksichtigt sind die 19 Kommissionen, welche noch nicht für die Gesamterneuerungswahlen freigegeben wurden.</w:t>
+        <w:t xml:space="preserve">Nicht berücksichtigt sind die </w:t>
+      </w:r>
+      <w:r>
+        <w:rPr>
+          <w:rFonts w:cs="Arial"/>
+          <w:sz w:val="16"/>
+          <w:szCs w:val="16"/>
+        </w:rPr>
+        <w:t>&lt;&lt;[informationNote.</w:t>
+      </w:r>
+      <w:r>
+        <w:rPr>
+          <w:rFonts w:cs="Arial"/>
+          <w:sz w:val="16"/>
+          <w:szCs w:val="16"/>
+        </w:rPr>
+        <w:t>u</w:t>
+      </w:r>
+      <w:r>
+        <w:rPr>
+          <w:rFonts w:cs="Arial"/>
+          <w:sz w:val="16"/>
+          <w:szCs w:val="16"/>
+        </w:rPr>
+        <w:t>nreleasedExtraParliamentaryCommittees</w:t>
+      </w:r>
+      <w:r>
+        <w:rPr>
+          <w:rFonts w:cs="Arial"/>
+          <w:sz w:val="16"/>
+          <w:szCs w:val="16"/>
+        </w:rPr>
+        <w:t>]&gt;&gt;</w:t>
+      </w:r>
+      <w:r>
+        <w:rPr>
+          <w:rFonts w:cs="Arial"/>
+          <w:sz w:val="16"/>
+          <w:szCs w:val="16"/>
+        </w:rPr>
+        <w:t xml:space="preserve"> Kommissionen, welche noch nicht für die Gesamterneuerungswahlen freigegeben wurden.</w:t>
       </w:r>
     </w:p>
   </w:footnote>
@@ -10335,7 +10373,47 @@
           <w:sz w:val="16"/>
           <w:szCs w:val="16"/>
         </w:rPr>
-        <w:t>Nicht berücksichtigt sind die 19 Kommissionen, welche noch nicht für die Gesamterneuerungswahlen freigegeben wurden.</w:t>
+        <w:t xml:space="preserve">Nicht berücksichtigt sind die </w:t>
+      </w:r>
+      <w:r>
+        <w:rPr>
+          <w:rFonts w:cs="Arial"/>
+          <w:sz w:val="16"/>
+          <w:szCs w:val="16"/>
+        </w:rPr>
+        <w:t>&lt;&lt;[informationNote.</w:t>
+      </w:r>
+      <w:r>
+        <w:rPr>
+          <w:rFonts w:cs="Arial"/>
+          <w:sz w:val="16"/>
+          <w:szCs w:val="16"/>
+        </w:rPr>
+        <w:t>u</w:t>
+      </w:r>
+      <w:r>
+        <w:rPr>
+          <w:rFonts w:cs="Arial"/>
+          <w:sz w:val="16"/>
+          <w:szCs w:val="16"/>
+        </w:rPr>
+        <w:t>nreleasedExtraParliamentaryCommittees</w:t>
+      </w:r>
+      <w:r>
+        <w:rPr>
+          <w:rFonts w:cs="Arial"/>
+          <w:sz w:val="16"/>
+          <w:szCs w:val="16"/>
+        </w:rPr>
+        <w:t>]&gt;&gt;</w:t>
+      </w:r>
+      <w:r>
+        <w:rPr>
+          <w:rFonts w:cs="Arial"/>
+          <w:sz w:val="16"/>
+          <w:szCs w:val="16"/>
+        </w:rPr>
+        <w:t xml:space="preserve"> Kommissionen, welche noch nicht für die Gesamterneuerungswahlen freigegeben wurden.</w:t>
       </w:r>
     </w:p>
   </w:footnote>

</xml_diff>

<commit_message>
feat: fix missing/wrong data on information note #BKDO-1032
</commit_message>
<xml_diff>
--- a/src/Bk.APG.Api/Templates/InformationNote_German.docx
+++ b/src/Bk.APG.Api/Templates/InformationNote_German.docx
@@ -1377,7 +1377,7 @@
       <w:tr>
         <w:tc>
           <w:tcPr>
-            <w:tcW w:w="2830" w:type="dxa"/>
+            <w:tcW w:w="2796" w:type="dxa"/>
           </w:tcPr>
           <w:p>
             <w:pPr>
@@ -1389,7 +1389,7 @@
         </w:tc>
         <w:tc>
           <w:tcPr>
-            <w:tcW w:w="1276" w:type="dxa"/>
+            <w:tcW w:w="1323" w:type="dxa"/>
           </w:tcPr>
           <w:p>
             <w:pPr>
@@ -1403,6 +1403,25 @@
                 <w:rFonts w:cs="Arial"/>
               </w:rPr>
               <w:t>1 Vakanz</w:t>
+            </w:r>
+          </w:p>
+        </w:tc>
+        <w:tc>
+          <w:tcPr>
+            <w:tcW w:w="1555" w:type="dxa"/>
+          </w:tcPr>
+          <w:p>
+            <w:pPr>
+              <w:jc w:val="center"/>
+              <w:rPr>
+                <w:rFonts w:cs="Arial"/>
+              </w:rPr>
+            </w:pPr>
+            <w:r>
+              <w:rPr>
+                <w:rFonts w:cs="Arial"/>
+              </w:rPr>
+              <w:t>2 Vakanzen</w:t>
             </w:r>
           </w:p>
         </w:tc>
@@ -1421,32 +1440,13 @@
               <w:rPr>
                 <w:rFonts w:cs="Arial"/>
               </w:rPr>
-              <w:t>2 Vakanzen</w:t>
+              <w:t>3 Vakanzen</w:t>
             </w:r>
           </w:p>
         </w:tc>
         <w:tc>
           <w:tcPr>
-            <w:tcW w:w="1560" w:type="dxa"/>
-          </w:tcPr>
-          <w:p>
-            <w:pPr>
-              <w:jc w:val="center"/>
-              <w:rPr>
-                <w:rFonts w:cs="Arial"/>
-              </w:rPr>
-            </w:pPr>
-            <w:r>
-              <w:rPr>
-                <w:rFonts w:cs="Arial"/>
-              </w:rPr>
-              <w:t>3 Vakanzen</w:t>
-            </w:r>
-          </w:p>
-        </w:tc>
-        <w:tc>
-          <w:tcPr>
-            <w:tcW w:w="1824" w:type="dxa"/>
+            <w:tcW w:w="1816" w:type="dxa"/>
           </w:tcPr>
           <w:p>
             <w:pPr>
@@ -1467,7 +1467,7 @@
       <w:tr>
         <w:tc>
           <w:tcPr>
-            <w:tcW w:w="2830" w:type="dxa"/>
+            <w:tcW w:w="2796" w:type="dxa"/>
           </w:tcPr>
           <w:p>
             <w:pPr>
@@ -1485,7 +1485,7 @@
         </w:tc>
         <w:tc>
           <w:tcPr>
-            <w:tcW w:w="1276" w:type="dxa"/>
+            <w:tcW w:w="1323" w:type="dxa"/>
           </w:tcPr>
           <w:p>
             <w:pPr>
@@ -1505,6 +1505,37 @@
                 <w:rFonts w:cs="Arial"/>
               </w:rPr>
               <w:t>oneVacanciesAuthoritiesCommittees</w:t>
+            </w:r>
+            <w:r>
+              <w:rPr>
+                <w:rFonts w:cs="Arial"/>
+              </w:rPr>
+              <w:t>]&gt;&gt;</w:t>
+            </w:r>
+          </w:p>
+        </w:tc>
+        <w:tc>
+          <w:tcPr>
+            <w:tcW w:w="1555" w:type="dxa"/>
+          </w:tcPr>
+          <w:p>
+            <w:pPr>
+              <w:jc w:val="center"/>
+              <w:rPr>
+                <w:rFonts w:cs="Arial"/>
+              </w:rPr>
+            </w:pPr>
+            <w:r>
+              <w:rPr>
+                <w:rFonts w:cs="Arial"/>
+              </w:rPr>
+              <w:t>&lt;&lt;[informationNote.</w:t>
+            </w:r>
+            <w:r>
+              <w:rPr>
+                <w:rFonts w:cs="Arial"/>
+              </w:rPr>
+              <w:t>twoVacanciesAuthoritiesCommittees</w:t>
             </w:r>
             <w:r>
               <w:rPr>
@@ -1535,7 +1566,7 @@
               <w:rPr>
                 <w:rFonts w:cs="Arial"/>
               </w:rPr>
-              <w:t>twoVacanciesAuthoritiesCommittees</w:t>
+              <w:t>threeVacanciesAuthoritiesCommittees</w:t>
             </w:r>
             <w:r>
               <w:rPr>
@@ -1547,38 +1578,7 @@
         </w:tc>
         <w:tc>
           <w:tcPr>
-            <w:tcW w:w="1560" w:type="dxa"/>
-          </w:tcPr>
-          <w:p>
-            <w:pPr>
-              <w:jc w:val="center"/>
-              <w:rPr>
-                <w:rFonts w:cs="Arial"/>
-              </w:rPr>
-            </w:pPr>
-            <w:r>
-              <w:rPr>
-                <w:rFonts w:cs="Arial"/>
-              </w:rPr>
-              <w:t>&lt;&lt;[informationNote.</w:t>
-            </w:r>
-            <w:r>
-              <w:rPr>
-                <w:rFonts w:cs="Arial"/>
-              </w:rPr>
-              <w:t>threeVacanciesAuthoritiesCommittees</w:t>
-            </w:r>
-            <w:r>
-              <w:rPr>
-                <w:rFonts w:cs="Arial"/>
-              </w:rPr>
-              <w:t>]&gt;&gt;</w:t>
-            </w:r>
-          </w:p>
-        </w:tc>
-        <w:tc>
-          <w:tcPr>
-            <w:tcW w:w="1824" w:type="dxa"/>
+            <w:tcW w:w="1816" w:type="dxa"/>
           </w:tcPr>
           <w:p>
             <w:pPr>
@@ -1611,7 +1611,7 @@
       <w:tr>
         <w:tc>
           <w:tcPr>
-            <w:tcW w:w="2830" w:type="dxa"/>
+            <w:tcW w:w="2796" w:type="dxa"/>
           </w:tcPr>
           <w:p>
             <w:pPr>
@@ -1629,7 +1629,7 @@
         </w:tc>
         <w:tc>
           <w:tcPr>
-            <w:tcW w:w="1276" w:type="dxa"/>
+            <w:tcW w:w="1323" w:type="dxa"/>
           </w:tcPr>
           <w:p>
             <w:pPr>
@@ -1649,6 +1649,37 @@
                 <w:rFonts w:cs="Arial"/>
               </w:rPr>
               <w:t>oneVacanciesAdministrationCommittees</w:t>
+            </w:r>
+            <w:r>
+              <w:rPr>
+                <w:rFonts w:cs="Arial"/>
+              </w:rPr>
+              <w:t>]&gt;&gt;</w:t>
+            </w:r>
+          </w:p>
+        </w:tc>
+        <w:tc>
+          <w:tcPr>
+            <w:tcW w:w="1555" w:type="dxa"/>
+          </w:tcPr>
+          <w:p>
+            <w:pPr>
+              <w:jc w:val="center"/>
+              <w:rPr>
+                <w:rFonts w:cs="Arial"/>
+              </w:rPr>
+            </w:pPr>
+            <w:r>
+              <w:rPr>
+                <w:rFonts w:cs="Arial"/>
+              </w:rPr>
+              <w:t>&lt;&lt;[informationNote.</w:t>
+            </w:r>
+            <w:r>
+              <w:rPr>
+                <w:rFonts w:cs="Arial"/>
+              </w:rPr>
+              <w:t>twoVacanciesAdministrationCommittees</w:t>
             </w:r>
             <w:r>
               <w:rPr>
@@ -1679,7 +1710,7 @@
               <w:rPr>
                 <w:rFonts w:cs="Arial"/>
               </w:rPr>
-              <w:t>twoVacanciesAdministrationCommittees</w:t>
+              <w:t>threeVacanciesAdministrationCommittees</w:t>
             </w:r>
             <w:r>
               <w:rPr>
@@ -1691,38 +1722,7 @@
         </w:tc>
         <w:tc>
           <w:tcPr>
-            <w:tcW w:w="1560" w:type="dxa"/>
-          </w:tcPr>
-          <w:p>
-            <w:pPr>
-              <w:jc w:val="center"/>
-              <w:rPr>
-                <w:rFonts w:cs="Arial"/>
-              </w:rPr>
-            </w:pPr>
-            <w:r>
-              <w:rPr>
-                <w:rFonts w:cs="Arial"/>
-              </w:rPr>
-              <w:t>&lt;&lt;[informationNote.</w:t>
-            </w:r>
-            <w:r>
-              <w:rPr>
-                <w:rFonts w:cs="Arial"/>
-              </w:rPr>
-              <w:t>threeVacanciesAdministrationCommittees</w:t>
-            </w:r>
-            <w:r>
-              <w:rPr>
-                <w:rFonts w:cs="Arial"/>
-              </w:rPr>
-              <w:t>]&gt;&gt;</w:t>
-            </w:r>
-          </w:p>
-        </w:tc>
-        <w:tc>
-          <w:tcPr>
-            <w:tcW w:w="1824" w:type="dxa"/>
+            <w:tcW w:w="1816" w:type="dxa"/>
           </w:tcPr>
           <w:p>
             <w:pPr>
@@ -1761,7 +1761,7 @@
       <w:tr>
         <w:tc>
           <w:tcPr>
-            <w:tcW w:w="2830" w:type="dxa"/>
+            <w:tcW w:w="2796" w:type="dxa"/>
           </w:tcPr>
           <w:p>
             <w:pPr>
@@ -1779,7 +1779,7 @@
         </w:tc>
         <w:tc>
           <w:tcPr>
-            <w:tcW w:w="1276" w:type="dxa"/>
+            <w:tcW w:w="1323" w:type="dxa"/>
           </w:tcPr>
           <w:p>
             <w:pPr>
@@ -1799,6 +1799,37 @@
                 <w:rFonts w:cs="Arial"/>
               </w:rPr>
               <w:t>oneVacanciesManagementCommittees</w:t>
+            </w:r>
+            <w:r>
+              <w:rPr>
+                <w:rFonts w:cs="Arial"/>
+              </w:rPr>
+              <w:t>]&gt;&gt;</w:t>
+            </w:r>
+          </w:p>
+        </w:tc>
+        <w:tc>
+          <w:tcPr>
+            <w:tcW w:w="1555" w:type="dxa"/>
+          </w:tcPr>
+          <w:p>
+            <w:pPr>
+              <w:jc w:val="center"/>
+              <w:rPr>
+                <w:rFonts w:cs="Arial"/>
+              </w:rPr>
+            </w:pPr>
+            <w:r>
+              <w:rPr>
+                <w:rFonts w:cs="Arial"/>
+              </w:rPr>
+              <w:t>&lt;&lt;[informationNote.</w:t>
+            </w:r>
+            <w:r>
+              <w:rPr>
+                <w:rFonts w:cs="Arial"/>
+              </w:rPr>
+              <w:t>twoVacanciesManagementCommittees</w:t>
             </w:r>
             <w:r>
               <w:rPr>
@@ -1829,7 +1860,7 @@
               <w:rPr>
                 <w:rFonts w:cs="Arial"/>
               </w:rPr>
-              <w:t>twoVacanciesManagementCommittees</w:t>
+              <w:t>threeVacanciesManagementCommittees</w:t>
             </w:r>
             <w:r>
               <w:rPr>
@@ -1841,38 +1872,7 @@
         </w:tc>
         <w:tc>
           <w:tcPr>
-            <w:tcW w:w="1560" w:type="dxa"/>
-          </w:tcPr>
-          <w:p>
-            <w:pPr>
-              <w:jc w:val="center"/>
-              <w:rPr>
-                <w:rFonts w:cs="Arial"/>
-              </w:rPr>
-            </w:pPr>
-            <w:r>
-              <w:rPr>
-                <w:rFonts w:cs="Arial"/>
-              </w:rPr>
-              <w:t>&lt;&lt;[informationNote.</w:t>
-            </w:r>
-            <w:r>
-              <w:rPr>
-                <w:rFonts w:cs="Arial"/>
-              </w:rPr>
-              <w:t>threeVacanciesManagementCommittees</w:t>
-            </w:r>
-            <w:r>
-              <w:rPr>
-                <w:rFonts w:cs="Arial"/>
-              </w:rPr>
-              <w:t>]&gt;&gt;</w:t>
-            </w:r>
-          </w:p>
-        </w:tc>
-        <w:tc>
-          <w:tcPr>
-            <w:tcW w:w="1824" w:type="dxa"/>
+            <w:tcW w:w="1816" w:type="dxa"/>
           </w:tcPr>
           <w:p>
             <w:pPr>
@@ -1905,7 +1905,7 @@
       <w:tr>
         <w:tc>
           <w:tcPr>
-            <w:tcW w:w="2830" w:type="dxa"/>
+            <w:tcW w:w="2796" w:type="dxa"/>
           </w:tcPr>
           <w:p>
             <w:pPr>
@@ -1918,16 +1918,14 @@
             <w:r>
               <w:rPr>
                 <w:rFonts w:cs="Arial"/>
-                <w:b/>
-                <w:bCs/>
-              </w:rPr>
-              <w:t>Total</w:t>
+              </w:rPr>
+              <w:t>Vertretungen des Bundes</w:t>
             </w:r>
           </w:p>
         </w:tc>
         <w:tc>
           <w:tcPr>
-            <w:tcW w:w="1276" w:type="dxa"/>
+            <w:tcW w:w="1323" w:type="dxa"/>
           </w:tcPr>
           <w:p>
             <w:pPr>
@@ -1941,26 +1939,67 @@
             <w:r>
               <w:rPr>
                 <w:rFonts w:cs="Arial"/>
+              </w:rPr>
+              <w:t>&lt;&lt;[informationNote.</w:t>
+            </w:r>
+            <w:r>
+              <w:rPr>
+                <w:rFonts w:cs="Arial"/>
+              </w:rPr>
+              <w:t>oneVacancies</w:t>
+            </w:r>
+            <w:r>
+              <w:rPr>
+                <w:rFonts w:cs="Arial"/>
+              </w:rPr>
+              <w:t>FederalAgenci</w:t>
+            </w:r>
+            <w:r>
+              <w:rPr>
+                <w:rFonts w:cs="Arial"/>
+              </w:rPr>
+              <w:lastRenderedPageBreak/>
+              <w:t>esCommittees]&gt;&gt;</w:t>
+            </w:r>
+          </w:p>
+        </w:tc>
+        <w:tc>
+          <w:tcPr>
+            <w:tcW w:w="1555" w:type="dxa"/>
+          </w:tcPr>
+          <w:p>
+            <w:pPr>
+              <w:jc w:val="center"/>
+              <w:rPr>
+                <w:rFonts w:cs="Arial"/>
                 <w:b/>
                 <w:bCs/>
               </w:rPr>
+            </w:pPr>
+            <w:r>
+              <w:rPr>
+                <w:rFonts w:cs="Arial"/>
+              </w:rPr>
+              <w:lastRenderedPageBreak/>
               <w:t>&lt;&lt;[informationNote.</w:t>
             </w:r>
             <w:r>
               <w:rPr>
                 <w:rFonts w:cs="Arial"/>
-                <w:b/>
-                <w:bCs/>
-              </w:rPr>
-              <w:t>oneVacanciesTotal</w:t>
-            </w:r>
-            <w:r>
-              <w:rPr>
-                <w:rFonts w:cs="Arial"/>
-                <w:b/>
-                <w:bCs/>
-              </w:rPr>
-              <w:t>]&gt;&gt;</w:t>
+              </w:rPr>
+              <w:t>two</w:t>
+            </w:r>
+            <w:r>
+              <w:rPr>
+                <w:rFonts w:cs="Arial"/>
+              </w:rPr>
+              <w:t>Vacancies</w:t>
+            </w:r>
+            <w:r>
+              <w:rPr>
+                <w:rFonts w:cs="Arial"/>
+              </w:rPr>
+              <w:t>FederalAgenciesCommittees]&gt;&gt;</w:t>
             </w:r>
           </w:p>
         </w:tc>
@@ -1980,32 +2019,32 @@
             <w:r>
               <w:rPr>
                 <w:rFonts w:cs="Arial"/>
-                <w:b/>
-                <w:bCs/>
               </w:rPr>
               <w:t>&lt;&lt;[informationNote.</w:t>
             </w:r>
             <w:r>
               <w:rPr>
                 <w:rFonts w:cs="Arial"/>
-                <w:b/>
-                <w:bCs/>
-              </w:rPr>
-              <w:t>twoVacanciesTotal</w:t>
-            </w:r>
-            <w:r>
-              <w:rPr>
-                <w:rFonts w:cs="Arial"/>
-                <w:b/>
-                <w:bCs/>
-              </w:rPr>
-              <w:t>]&gt;&gt;</w:t>
+              </w:rPr>
+              <w:t>three</w:t>
+            </w:r>
+            <w:r>
+              <w:rPr>
+                <w:rFonts w:cs="Arial"/>
+              </w:rPr>
+              <w:t>Vacancies</w:t>
+            </w:r>
+            <w:r>
+              <w:rPr>
+                <w:rFonts w:cs="Arial"/>
+              </w:rPr>
+              <w:t>FederalAgenciesCommittees]&gt;&gt;</w:t>
             </w:r>
           </w:p>
         </w:tc>
         <w:tc>
           <w:tcPr>
-            <w:tcW w:w="1560" w:type="dxa"/>
+            <w:tcW w:w="1816" w:type="dxa"/>
           </w:tcPr>
           <w:p>
             <w:pPr>
@@ -2019,32 +2058,173 @@
             <w:r>
               <w:rPr>
                 <w:rFonts w:cs="Arial"/>
+              </w:rPr>
+              <w:t>&lt;&lt;[informationNote.</w:t>
+            </w:r>
+            <w:r>
+              <w:rPr>
+                <w:rFonts w:cs="Arial"/>
+              </w:rPr>
+              <w:t>four</w:t>
+            </w:r>
+            <w:r>
+              <w:rPr>
+                <w:rFonts w:cs="Arial"/>
+              </w:rPr>
+              <w:t>Vacancies</w:t>
+            </w:r>
+            <w:r>
+              <w:rPr>
+                <w:rFonts w:cs="Arial"/>
+              </w:rPr>
+              <w:t>FederalAgenciesCommittees]&gt;&gt;</w:t>
+            </w:r>
+          </w:p>
+        </w:tc>
+      </w:tr>
+      <w:tr>
+        <w:tc>
+          <w:tcPr>
+            <w:tcW w:w="2796" w:type="dxa"/>
+          </w:tcPr>
+          <w:p>
+            <w:pPr>
+              <w:rPr>
+                <w:rFonts w:cs="Arial"/>
                 <w:b/>
                 <w:bCs/>
               </w:rPr>
-              <w:t>&lt;&lt;[informationNote.</w:t>
-            </w:r>
+            </w:pPr>
             <w:r>
               <w:rPr>
                 <w:rFonts w:cs="Arial"/>
                 <w:b/>
                 <w:bCs/>
               </w:rPr>
-              <w:t>threeVacanciesTotal</w:t>
-            </w:r>
-            <w:r>
-              <w:rPr>
-                <w:rFonts w:cs="Arial"/>
-                <w:b/>
-                <w:bCs/>
-              </w:rPr>
-              <w:t>]&gt;&gt;</w:t>
+              <w:t>Total</w:t>
             </w:r>
           </w:p>
         </w:tc>
         <w:tc>
           <w:tcPr>
-            <w:tcW w:w="1824" w:type="dxa"/>
+            <w:tcW w:w="1323" w:type="dxa"/>
+          </w:tcPr>
+          <w:p>
+            <w:pPr>
+              <w:jc w:val="center"/>
+              <w:rPr>
+                <w:rFonts w:cs="Arial"/>
+                <w:b/>
+                <w:bCs/>
+              </w:rPr>
+            </w:pPr>
+            <w:r>
+              <w:rPr>
+                <w:rFonts w:cs="Arial"/>
+                <w:b/>
+                <w:bCs/>
+              </w:rPr>
+              <w:t>&lt;&lt;[informationNote.</w:t>
+            </w:r>
+            <w:r>
+              <w:rPr>
+                <w:rFonts w:cs="Arial"/>
+                <w:b/>
+                <w:bCs/>
+              </w:rPr>
+              <w:t>oneVacanciesTotal</w:t>
+            </w:r>
+            <w:r>
+              <w:rPr>
+                <w:rFonts w:cs="Arial"/>
+                <w:b/>
+                <w:bCs/>
+              </w:rPr>
+              <w:t>]&gt;&gt;</w:t>
+            </w:r>
+          </w:p>
+        </w:tc>
+        <w:tc>
+          <w:tcPr>
+            <w:tcW w:w="1555" w:type="dxa"/>
+          </w:tcPr>
+          <w:p>
+            <w:pPr>
+              <w:jc w:val="center"/>
+              <w:rPr>
+                <w:rFonts w:cs="Arial"/>
+                <w:b/>
+                <w:bCs/>
+              </w:rPr>
+            </w:pPr>
+            <w:r>
+              <w:rPr>
+                <w:rFonts w:cs="Arial"/>
+                <w:b/>
+                <w:bCs/>
+              </w:rPr>
+              <w:t>&lt;&lt;[informationNote.</w:t>
+            </w:r>
+            <w:r>
+              <w:rPr>
+                <w:rFonts w:cs="Arial"/>
+                <w:b/>
+                <w:bCs/>
+              </w:rPr>
+              <w:t>twoVacanciesTotal</w:t>
+            </w:r>
+            <w:r>
+              <w:rPr>
+                <w:rFonts w:cs="Arial"/>
+                <w:b/>
+                <w:bCs/>
+              </w:rPr>
+              <w:t>]&gt;&gt;</w:t>
+            </w:r>
+          </w:p>
+        </w:tc>
+        <w:tc>
+          <w:tcPr>
+            <w:tcW w:w="1559" w:type="dxa"/>
+          </w:tcPr>
+          <w:p>
+            <w:pPr>
+              <w:jc w:val="center"/>
+              <w:rPr>
+                <w:rFonts w:cs="Arial"/>
+                <w:b/>
+                <w:bCs/>
+              </w:rPr>
+            </w:pPr>
+            <w:r>
+              <w:rPr>
+                <w:rFonts w:cs="Arial"/>
+                <w:b/>
+                <w:bCs/>
+              </w:rPr>
+              <w:t>&lt;&lt;[informationNote.</w:t>
+            </w:r>
+            <w:r>
+              <w:rPr>
+                <w:rFonts w:cs="Arial"/>
+                <w:b/>
+                <w:bCs/>
+              </w:rPr>
+              <w:t>threeVacanciesTotal</w:t>
+            </w:r>
+            <w:r>
+              <w:rPr>
+                <w:rFonts w:cs="Arial"/>
+                <w:b/>
+                <w:bCs/>
+              </w:rPr>
+              <w:t>]&gt;&gt;</w:t>
+            </w:r>
+          </w:p>
+        </w:tc>
+        <w:tc>
+          <w:tcPr>
+            <w:tcW w:w="1816" w:type="dxa"/>
           </w:tcPr>
           <w:p>
             <w:pPr>

</xml_diff>

<commit_message>
feat: update logic for information note #BKDO-4798
</commit_message>
<xml_diff>
--- a/src/Bk.APG.Api/Templates/InformationNote_German.docx
+++ b/src/Bk.APG.Api/Templates/InformationNote_German.docx
@@ -208,6 +208,7 @@
       <w:r>
         <w:rPr>
           <w:rFonts w:cs="Arial"/>
+          <w:vertAlign w:val="superscript"/>
         </w:rPr>
         <w:footnoteReference w:id="1"/>
       </w:r>
@@ -235,7 +236,38 @@
         <w:rPr>
           <w:rFonts w:cs="Arial"/>
         </w:rPr>
-        <w:t xml:space="preserve">Die Departemente wurden im Januar </w:t>
+        <w:t xml:space="preserve">Die Departemente wurden im </w:t>
+      </w:r>
+      <w:r>
+        <w:rPr>
+          <w:rFonts w:cs="Arial"/>
+          <w:color w:val="FF0000"/>
+          <w:highlight w:val="yellow"/>
+        </w:rPr>
+        <w:t>[M</w:t>
+      </w:r>
+      <w:r>
+        <w:rPr>
+          <w:rFonts w:cs="Arial"/>
+          <w:color w:val="FF0000"/>
+          <w:highlight w:val="yellow"/>
+        </w:rPr>
+        <w:t>ona</w:t>
+      </w:r>
+      <w:r>
+        <w:rPr>
+          <w:rFonts w:cs="Arial"/>
+          <w:color w:val="FF0000"/>
+          <w:highlight w:val="yellow"/>
+        </w:rPr>
+        <w:t>t]</w:t>
+      </w:r>
+      <w:r>
+        <w:rPr>
+          <w:rFonts w:cs="Arial"/>
+          <w:color w:val="FF0000"/>
+        </w:rPr>
+        <w:t xml:space="preserve"> </w:t>
       </w:r>
       <w:r>
         <w:rPr>
@@ -247,7 +279,21 @@
         <w:rPr>
           <w:rFonts w:cs="Arial"/>
         </w:rPr>
-        <w:t xml:space="preserve">mit Schreiben des Bundeskanzlers beauftragt, bis Ende Juni </w:t>
+        <w:t xml:space="preserve">mit Schreiben des Bundeskanzlers beauftragt, bis </w:t>
+      </w:r>
+      <w:r>
+        <w:rPr>
+          <w:rFonts w:cs="Arial"/>
+          <w:color w:val="FF0000"/>
+          <w:highlight w:val="yellow"/>
+        </w:rPr>
+        <w:t>[Frist]</w:t>
+      </w:r>
+      <w:r>
+        <w:rPr>
+          <w:rFonts w:cs="Arial"/>
+        </w:rPr>
+        <w:t xml:space="preserve"> </w:t>
       </w:r>
       <w:r>
         <w:rPr>
@@ -279,7 +325,21 @@
         <w:rPr>
           <w:rFonts w:cs="Arial"/>
         </w:rPr>
-        <w:t xml:space="preserve">Mit vorliegender Informationsnotiz wird über den Stand der Wahlanträge sowie die aktuelle Vertretung der Geschlechter und der Sprachgemeinschaften berichtet, sowie auf bestehende Mehrfachmandate aufmerksam gemacht. Es sind alle bis 31. Juli </w:t>
+        <w:t xml:space="preserve">Mit vorliegender Informationsnotiz wird über den Stand der Wahlanträge sowie die aktuelle Vertretung der Geschlechter und der Sprachgemeinschaften berichtet, sowie auf bestehende Mehrfachmandate aufmerksam gemacht. Es sind alle bis </w:t>
+      </w:r>
+      <w:r>
+        <w:rPr>
+          <w:rFonts w:cs="Arial"/>
+          <w:color w:val="FF0000"/>
+          <w:highlight w:val="yellow"/>
+        </w:rPr>
+        <w:t>[Datum]</w:t>
+      </w:r>
+      <w:r>
+        <w:rPr>
+          <w:rFonts w:cs="Arial"/>
+        </w:rPr>
+        <w:t xml:space="preserve"> </w:t>
       </w:r>
       <w:r>
         <w:rPr>
@@ -343,23 +403,17 @@
       <w:r>
         <w:rPr>
           <w:rFonts w:cs="Arial"/>
+          <w:color w:val="FF0000"/>
           <w:highlight w:val="yellow"/>
         </w:rPr>
-        <w:t>30.</w:t>
-      </w:r>
-      <w:r>
-        <w:rPr>
-          <w:rFonts w:cs="Arial"/>
-          <w:highlight w:val="yellow"/>
-        </w:rPr>
-        <w:t xml:space="preserve"> </w:t>
-      </w:r>
-      <w:r>
-        <w:rPr>
-          <w:rFonts w:cs="Arial"/>
-          <w:highlight w:val="yellow"/>
-        </w:rPr>
-        <w:t>Oktober</w:t>
+        <w:t>[Datum</w:t>
+      </w:r>
+      <w:r>
+        <w:rPr>
+          <w:rFonts w:cs="Arial"/>
+          <w:color w:val="FF0000"/>
+        </w:rPr>
+        <w:t>]</w:t>
       </w:r>
       <w:r>
         <w:rPr>
@@ -404,40 +458,51 @@
       </w:pPr>
       <w:r>
         <w:lastRenderedPageBreak/>
-        <w:t>Umfang der Gesamterneuerungswahlen und erfasste Gremien</w:t>
-      </w:r>
-    </w:p>
-    <w:p>
-      <w:pPr>
-        <w:rPr>
-          <w:rFonts w:cs="Arial"/>
-        </w:rPr>
-      </w:pPr>
-    </w:p>
-    <w:p>
-      <w:pPr>
-        <w:rPr>
-          <w:rFonts w:cs="Arial"/>
-        </w:rPr>
-      </w:pPr>
-      <w:r>
-        <w:rPr>
-          <w:rFonts w:cs="Arial"/>
-        </w:rPr>
-        <w:t xml:space="preserve">In Anhang 1 werden die Gremien aufgelistet, für welche die Wahlanträge vom zuständigen Departement erfasst und </w:t>
-      </w:r>
-      <w:r>
-        <w:rPr>
-          <w:rFonts w:cs="Arial"/>
-          <w:color w:val="000000"/>
-        </w:rPr>
-        <w:t xml:space="preserve">für die Gesamterneuerungswahl </w:t>
-      </w:r>
-      <w:r>
-        <w:rPr>
-          <w:rFonts w:cs="Arial"/>
-        </w:rPr>
-        <w:t xml:space="preserve">freigegeben wurden. Insgesamt wurden bisher für </w:t>
+        <w:t>Umfang der Gesamterneuerungswahlen</w:t>
+      </w:r>
+    </w:p>
+    <w:p>
+      <w:pPr>
+        <w:rPr>
+          <w:rFonts w:cs="Arial"/>
+        </w:rPr>
+      </w:pPr>
+    </w:p>
+    <w:p>
+      <w:pPr>
+        <w:rPr>
+          <w:rFonts w:cs="Arial"/>
+        </w:rPr>
+      </w:pPr>
+      <w:r>
+        <w:rPr>
+          <w:rFonts w:cs="Arial"/>
+        </w:rPr>
+        <w:t xml:space="preserve">In Anhang 1 werden die Gremien aufgelistet, für welche </w:t>
+      </w:r>
+      <w:r>
+        <w:rPr>
+          <w:rFonts w:cs="Arial"/>
+        </w:rPr>
+        <w:t>die</w:t>
+      </w:r>
+      <w:r>
+        <w:rPr>
+          <w:rFonts w:cs="Arial"/>
+        </w:rPr>
+        <w:t xml:space="preserve"> Wahlvorschläge</w:t>
+      </w:r>
+      <w:r>
+        <w:rPr>
+          <w:rFonts w:cs="Arial"/>
+        </w:rPr>
+        <w:t xml:space="preserve"> v</w:t>
+      </w:r>
+      <w:r>
+        <w:rPr>
+          <w:rFonts w:cs="Arial"/>
+        </w:rPr>
+        <w:t xml:space="preserve">om zuständigen Departement erfasst wurden. Insgesamt wurden bisher für </w:t>
       </w:r>
       <w:r>
         <w:rPr>
@@ -485,7 +550,19 @@
         <w:rPr>
           <w:rFonts w:cs="Arial"/>
         </w:rPr>
-        <w:t xml:space="preserve"> Gremien die Wahlanträge erfasst und freigegeben:</w:t>
+        <w:t xml:space="preserve"> Gremien die Wahl</w:t>
+      </w:r>
+      <w:r>
+        <w:rPr>
+          <w:rFonts w:cs="Arial"/>
+        </w:rPr>
+        <w:t>vorschläge</w:t>
+      </w:r>
+      <w:r>
+        <w:rPr>
+          <w:rFonts w:cs="Arial"/>
+        </w:rPr>
+        <w:t xml:space="preserve"> erfasst:</w:t>
       </w:r>
     </w:p>
     <w:p>
@@ -579,7 +656,23 @@
                 <w:b/>
                 <w:i/>
               </w:rPr>
-              <w:t xml:space="preserve">Wahlanträge </w:t>
+              <w:t>Wahl</w:t>
+            </w:r>
+            <w:r>
+              <w:rPr>
+                <w:rFonts w:cs="Arial"/>
+                <w:b/>
+                <w:i/>
+              </w:rPr>
+              <w:t>vorschläge</w:t>
+            </w:r>
+            <w:r>
+              <w:rPr>
+                <w:rFonts w:cs="Arial"/>
+                <w:b/>
+                <w:i/>
+              </w:rPr>
+              <w:t xml:space="preserve"> </w:t>
             </w:r>
           </w:p>
           <w:p>
@@ -620,7 +713,23 @@
                 <w:b/>
                 <w:i/>
               </w:rPr>
-              <w:t xml:space="preserve">Wahlanträge </w:t>
+              <w:t>Wahl</w:t>
+            </w:r>
+            <w:r>
+              <w:rPr>
+                <w:rFonts w:cs="Arial"/>
+                <w:b/>
+                <w:i/>
+              </w:rPr>
+              <w:t>vorschläge</w:t>
+            </w:r>
+            <w:r>
+              <w:rPr>
+                <w:rFonts w:cs="Arial"/>
+                <w:b/>
+                <w:i/>
+              </w:rPr>
+              <w:t xml:space="preserve"> </w:t>
             </w:r>
           </w:p>
           <w:p>
@@ -1212,26 +1321,6 @@
       </w:pPr>
       <w:bookmarkStart w:id="0" w:name="_Hlk142385339"/>
     </w:p>
-    <w:p>
-      <w:pPr>
-        <w:rPr>
-          <w:rFonts w:cs="Arial"/>
-        </w:rPr>
-      </w:pPr>
-      <w:r>
-        <w:rPr>
-          <w:rFonts w:cs="Arial"/>
-        </w:rPr>
-        <w:t>Im Rahmen der letzten Gesamterneuerungswahl hat der Bundesrat die Ernennung der Vertretungen des Bundes in grenzüberschreitenden Gremien an die Departemente delegiert (EXE 2019.2130). Diese Gremien sind folglich nicht mehr Gegenstand der Gesamterneuerungswahlen.</w:t>
-      </w:r>
-    </w:p>
-    <w:p>
-      <w:pPr>
-        <w:rPr>
-          <w:rFonts w:cs="Arial"/>
-        </w:rPr>
-      </w:pPr>
-    </w:p>
     <w:bookmarkEnd w:id="0"/>
     <w:p>
       <w:pPr>
@@ -1243,41 +1332,36 @@
         <w:ind w:left="360" w:hanging="360"/>
       </w:pPr>
       <w:r>
-        <w:lastRenderedPageBreak/>
-        <w:t>Ausstehende Wahlanträge</w:t>
-      </w:r>
-    </w:p>
-    <w:p>
-      <w:pPr>
-        <w:rPr>
-          <w:rFonts w:cs="Arial"/>
-        </w:rPr>
-      </w:pPr>
-    </w:p>
-    <w:p>
-      <w:pPr>
-        <w:rPr>
-          <w:rFonts w:cs="Arial"/>
-        </w:rPr>
-      </w:pPr>
-      <w:r>
-        <w:rPr>
-          <w:rFonts w:cs="Arial"/>
-        </w:rPr>
-        <w:t xml:space="preserve">In Anhang 2 werden die Gremien aufgelistet, für welche die Wahlanträge vom zuständigen Departement noch nicht </w:t>
-      </w:r>
-      <w:r>
-        <w:rPr>
-          <w:rFonts w:cs="Arial"/>
-          <w:color w:val="000000"/>
-        </w:rPr>
-        <w:t xml:space="preserve">für die Gesamterneuerungswahl </w:t>
-      </w:r>
-      <w:r>
-        <w:rPr>
-          <w:rFonts w:cs="Arial"/>
-        </w:rPr>
-        <w:t>freigegeben wurden, da noch Vakanzen bestehen.</w:t>
+        <w:t>Ausstehende Wahl</w:t>
+      </w:r>
+      <w:r>
+        <w:t>vorschläge</w:t>
+      </w:r>
+    </w:p>
+    <w:p>
+      <w:pPr>
+        <w:rPr>
+          <w:rFonts w:cs="Arial"/>
+        </w:rPr>
+      </w:pPr>
+    </w:p>
+    <w:p>
+      <w:pPr>
+        <w:rPr>
+          <w:rFonts w:cs="Arial"/>
+        </w:rPr>
+      </w:pPr>
+      <w:r>
+        <w:rPr>
+          <w:rFonts w:cs="Arial"/>
+        </w:rPr>
+        <w:t>In Anhang 2 werden die Gremien aufgelistet,</w:t>
+      </w:r>
+      <w:r>
+        <w:rPr>
+          <w:rFonts w:cs="Arial"/>
+        </w:rPr>
+        <w:t xml:space="preserve"> die bereits einen Wahlvorschlag validiert haben und dabei eine oder mehrere Vakanzen angekündigt haben.</w:t>
       </w:r>
     </w:p>
     <w:p>
@@ -1309,14 +1393,21 @@
         <w:rPr>
           <w:rFonts w:cs="Arial"/>
         </w:rPr>
-        <w:t>unreleased</w:t>
-      </w:r>
-      <w:r>
-        <w:rPr>
-          <w:rFonts w:cs="Arial"/>
-        </w:rPr>
-        <w:t>Committees</w:t>
-      </w:r>
+        <w:t>t</w:t>
+      </w:r>
+      <w:r>
+        <w:rPr>
+          <w:rFonts w:cs="Arial"/>
+        </w:rPr>
+        <w:t>otalCommitteesWithVacancies</w:t>
+      </w:r>
+    </w:p>
+    <w:p>
+      <w:pPr>
+        <w:rPr>
+          <w:rFonts w:cs="Arial"/>
+        </w:rPr>
+      </w:pPr>
       <w:r>
         <w:rPr>
           <w:rFonts w:cs="Arial"/>
@@ -1351,7 +1442,13 @@
         <w:rPr>
           <w:rFonts w:cs="Arial"/>
         </w:rPr>
-        <w:t xml:space="preserve"> Gremien noch nicht für die Gesamterneuerungswahl freigegeben:</w:t>
+        <w:t xml:space="preserve"> Gremien</w:t>
+      </w:r>
+      <w:r>
+        <w:rPr>
+          <w:rFonts w:cs="Arial"/>
+        </w:rPr>
+        <w:t xml:space="preserve"> mit Vakanzen im Vahlvorschlag validiert.</w:t>
       </w:r>
     </w:p>
     <w:p>
@@ -1952,14 +2049,7 @@
               <w:rPr>
                 <w:rFonts w:cs="Arial"/>
               </w:rPr>
-              <w:t>FederalAgenci</w:t>
-            </w:r>
-            <w:r>
-              <w:rPr>
-                <w:rFonts w:cs="Arial"/>
-              </w:rPr>
-              <w:lastRenderedPageBreak/>
-              <w:t>esCommittees]&gt;&gt;</w:t>
+              <w:t>FederalAgenciesCommittees]&gt;&gt;</w:t>
             </w:r>
           </w:p>
         </w:tc>
@@ -1980,7 +2070,6 @@
               <w:rPr>
                 <w:rFonts w:cs="Arial"/>
               </w:rPr>
-              <w:lastRenderedPageBreak/>
               <w:t>&lt;&lt;[informationNote.</w:t>
             </w:r>
             <w:r>
@@ -2114,7 +2203,16 @@
                 <w:b/>
                 <w:bCs/>
               </w:rPr>
-              <w:t>oneVacanciesTotal</w:t>
+              <w:t>one</w:t>
+            </w:r>
+            <w:r>
+              <w:rPr>
+                <w:rFonts w:cs="Arial"/>
+                <w:b/>
+                <w:bCs/>
+              </w:rPr>
+              <w:lastRenderedPageBreak/>
+              <w:t>VacanciesTotal</w:t>
             </w:r>
             <w:r>
               <w:rPr>
@@ -2145,6 +2243,7 @@
                 <w:b/>
                 <w:bCs/>
               </w:rPr>
+              <w:lastRenderedPageBreak/>
               <w:t>&lt;&lt;[informationNote.</w:t>
             </w:r>
             <w:r>
@@ -2153,7 +2252,16 @@
                 <w:b/>
                 <w:bCs/>
               </w:rPr>
-              <w:t>twoVacanciesTotal</w:t>
+              <w:t>two</w:t>
+            </w:r>
+            <w:r>
+              <w:rPr>
+                <w:rFonts w:cs="Arial"/>
+                <w:b/>
+                <w:bCs/>
+              </w:rPr>
+              <w:lastRenderedPageBreak/>
+              <w:t>VacanciesTotal</w:t>
             </w:r>
             <w:r>
               <w:rPr>
@@ -2184,6 +2292,7 @@
                 <w:b/>
                 <w:bCs/>
               </w:rPr>
+              <w:lastRenderedPageBreak/>
               <w:t>&lt;&lt;[informationNote.</w:t>
             </w:r>
             <w:r>
@@ -2192,7 +2301,16 @@
                 <w:b/>
                 <w:bCs/>
               </w:rPr>
-              <w:t>threeVacanciesTotal</w:t>
+              <w:t>three</w:t>
+            </w:r>
+            <w:r>
+              <w:rPr>
+                <w:rFonts w:cs="Arial"/>
+                <w:b/>
+                <w:bCs/>
+              </w:rPr>
+              <w:lastRenderedPageBreak/>
+              <w:t>VacanciesTotal</w:t>
             </w:r>
             <w:r>
               <w:rPr>
@@ -2223,6 +2341,7 @@
                 <w:b/>
                 <w:bCs/>
               </w:rPr>
+              <w:lastRenderedPageBreak/>
               <w:t>&lt;&lt;[informationNote.</w:t>
             </w:r>
             <w:r>
@@ -2301,29 +2420,99 @@
         <w:rPr>
           <w:rFonts w:cs="Arial"/>
         </w:rPr>
-        <w:t>Am 23. November 2022 hat der Bundesrat entschieden, die Geschlechterquote von 30</w:t>
-      </w:r>
-      <w:r>
-        <w:rPr>
-          <w:rFonts w:cs="Arial"/>
+        <w:t>In Anhang 3 werden diejenigen APK (Behörden- und Verwaltungskommissionen) aufgeführt, welche den in Artikel 8</w:t>
+      </w:r>
+      <w:r>
+        <w:rPr>
+          <w:rFonts w:cs="Arial"/>
+          <w:i/>
+        </w:rPr>
+        <w:t>c</w:t>
+      </w:r>
+      <w:r>
+        <w:rPr>
+          <w:rFonts w:cs="Arial"/>
+        </w:rPr>
+        <w:t xml:space="preserve"> RVOV vorgeschriebenen Frauen- oder Männeranteil von </w:t>
+      </w:r>
+      <w:r>
+        <w:rPr>
+          <w:rFonts w:cs="Arial"/>
+        </w:rPr>
+        <w:t>&lt;&lt;[informationNote.</w:t>
+      </w:r>
+      <w:r>
+        <w:rPr>
+          <w:rFonts w:cs="Arial"/>
+        </w:rPr>
+        <w:t>expectedGenderPercentage</w:t>
+      </w:r>
+      <w:r>
+        <w:rPr>
+          <w:rFonts w:cs="Arial"/>
+        </w:rPr>
+        <w:t>]&gt;&gt;</w:t>
+      </w:r>
+      <w:r>
+        <w:rPr>
+          <w:rFonts w:cs="Arial"/>
+        </w:rPr>
+        <w:t xml:space="preserve"> %</w:t>
+      </w:r>
+      <w:r>
+        <w:rPr>
+          <w:rFonts w:cs="Arial"/>
+        </w:rPr>
+        <w:t xml:space="preserve"> im validierten Wahlvorschlag</w:t>
+      </w:r>
+      <w:r>
+        <w:rPr>
+          <w:rFonts w:cs="Arial"/>
+        </w:rPr>
+        <w:t xml:space="preserve"> unterschreiten. Es ist anzumerken, dass die Ersatzmitglieder für die Quotenberechnung berücksichtigt werden.</w:t>
+      </w:r>
+    </w:p>
+    <w:p>
+      <w:pPr>
+        <w:rPr>
+          <w:rFonts w:cs="Arial"/>
+        </w:rPr>
+      </w:pPr>
+    </w:p>
+    <w:p>
+      <w:pPr>
+        <w:rPr>
+          <w:rFonts w:cs="Arial"/>
+          <w:lang w:eastAsia="de-DE"/>
+        </w:rPr>
+      </w:pPr>
+      <w:r>
+        <w:rPr>
+          <w:rFonts w:cs="Arial"/>
+          <w:lang w:eastAsia="de-DE"/>
+        </w:rPr>
+        <w:t>Insgesamt sind die Geschlechter in den bis</w:t>
+      </w:r>
+      <w:r>
+        <w:rPr>
+          <w:rFonts w:cs="Arial"/>
+          <w:lang w:eastAsia="de-DE"/>
         </w:rPr>
         <w:t xml:space="preserve"> </w:t>
       </w:r>
       <w:r>
         <w:rPr>
           <w:rFonts w:cs="Arial"/>
-        </w:rPr>
-        <w:t xml:space="preserve">% auf </w:t>
-      </w:r>
-      <w:r>
-        <w:rPr>
-          <w:rFonts w:cs="Arial"/>
-        </w:rPr>
-        <w:t>&lt;&lt;[informationNote.expectedGenderPercentage]&gt;&gt;</w:t>
-      </w:r>
-      <w:r>
-        <w:rPr>
-          <w:rFonts w:cs="Arial"/>
+          <w:color w:val="FF0000"/>
+          <w:highlight w:val="yellow"/>
+          <w:lang w:eastAsia="de-DE"/>
+        </w:rPr>
+        <w:t>[Datum]</w:t>
+      </w:r>
+      <w:r>
+        <w:rPr>
+          <w:rFonts w:cs="Arial"/>
+          <w:lang w:eastAsia="de-DE"/>
         </w:rPr>
         <w:t xml:space="preserve"> </w:t>
       </w:r>
@@ -2331,140 +2520,13 @@
         <w:rPr>
           <w:rFonts w:cs="Arial"/>
         </w:rPr>
-        <w:t>% zu erhöhen (EXE 2022.2748). Die Änderung des Artikels 8</w:t>
-      </w:r>
-      <w:r>
-        <w:rPr>
-          <w:rFonts w:cs="Arial"/>
-          <w:i/>
-          <w:iCs/>
-        </w:rPr>
-        <w:t>c</w:t>
-      </w:r>
-      <w:r>
-        <w:rPr>
-          <w:rFonts w:cs="Arial"/>
-        </w:rPr>
-        <w:t xml:space="preserve"> RVOV ist am 1. Januar 2023 in Kraft getreten (EXE 2022.2747). </w:t>
-      </w:r>
-    </w:p>
-    <w:p>
-      <w:pPr>
-        <w:rPr>
-          <w:rFonts w:cs="Arial"/>
-        </w:rPr>
-      </w:pPr>
-    </w:p>
-    <w:p>
-      <w:pPr>
-        <w:rPr>
-          <w:rFonts w:cs="Arial"/>
-        </w:rPr>
-      </w:pPr>
-      <w:r>
-        <w:rPr>
-          <w:rFonts w:cs="Arial"/>
-        </w:rPr>
-        <w:t>In Anhang 3 werden diejenigen APK (Behörden- und Verwaltungskommissionen) aufgeführt, welche den in Artikel 8</w:t>
-      </w:r>
-      <w:r>
-        <w:rPr>
-          <w:rFonts w:cs="Arial"/>
-          <w:i/>
-        </w:rPr>
-        <w:t>c</w:t>
-      </w:r>
-      <w:r>
-        <w:rPr>
-          <w:rFonts w:cs="Arial"/>
-        </w:rPr>
-        <w:t xml:space="preserve"> RVOV vorgeschriebenen Frauen- oder Männeranteil von </w:t>
-      </w:r>
-      <w:r>
-        <w:rPr>
-          <w:rFonts w:cs="Arial"/>
-        </w:rPr>
-        <w:t>&lt;&lt;[informationNote.</w:t>
-      </w:r>
-      <w:r>
-        <w:rPr>
-          <w:rFonts w:cs="Arial"/>
-        </w:rPr>
-        <w:t>expectedGenderPercentage</w:t>
-      </w:r>
-      <w:r>
-        <w:rPr>
-          <w:rFonts w:cs="Arial"/>
-        </w:rPr>
-        <w:t>]&gt;&gt;</w:t>
-      </w:r>
-      <w:r>
-        <w:rPr>
-          <w:rFonts w:cs="Arial"/>
-        </w:rPr>
-        <w:t xml:space="preserve"> %</w:t>
-      </w:r>
-      <w:r>
-        <w:rPr>
-          <w:rFonts w:cs="Arial"/>
-        </w:rPr>
-        <w:t xml:space="preserve"> unterschreiten. Es ist anzumerken, dass die Ersatzmitglieder für die Quotenberechnung berücksichtigt werden.</w:t>
-      </w:r>
-    </w:p>
-    <w:p>
-      <w:pPr>
-        <w:rPr>
-          <w:rFonts w:cs="Arial"/>
-        </w:rPr>
-      </w:pPr>
-    </w:p>
-    <w:p>
-      <w:pPr>
-        <w:rPr>
-          <w:rFonts w:cs="Arial"/>
-          <w:lang w:eastAsia="de-DE"/>
-        </w:rPr>
-      </w:pPr>
-      <w:r>
-        <w:rPr>
-          <w:rFonts w:cs="Arial"/>
-          <w:lang w:eastAsia="de-DE"/>
-        </w:rPr>
-        <w:t xml:space="preserve">Insgesamt sind die Geschlechter in den bis </w:t>
-      </w:r>
-      <w:r>
-        <w:rPr>
-          <w:rFonts w:cs="Arial"/>
-          <w:highlight w:val="yellow"/>
-          <w:lang w:eastAsia="de-DE"/>
-        </w:rPr>
-        <w:t>31. Juli</w:t>
-      </w:r>
-      <w:r>
-        <w:rPr>
-          <w:rFonts w:cs="Arial"/>
-          <w:lang w:eastAsia="de-DE"/>
-        </w:rPr>
-        <w:t xml:space="preserve"> </w:t>
-      </w:r>
-      <w:r>
-        <w:rPr>
-          <w:rFonts w:cs="Arial"/>
-        </w:rPr>
         <w:t>&lt;&lt;[informationNote.currentYear]&gt;&gt;</w:t>
       </w:r>
       <w:r>
         <w:rPr>
           <w:rFonts w:cs="Arial"/>
-          <w:lang w:eastAsia="de-DE"/>
-        </w:rPr>
-        <w:t xml:space="preserve"> zur Gesamterneuerungswahl freigegebenen </w:t>
-      </w:r>
-      <w:r>
-        <w:rPr>
-          <w:rFonts w:cs="Arial"/>
-        </w:rPr>
-        <w:t>APK</w:t>
+        </w:rPr>
+        <w:t xml:space="preserve"> validierten Wahlvorschlägen der APK</w:t>
       </w:r>
       <w:r>
         <w:rPr>
@@ -2696,27 +2758,35 @@
           <w:rFonts w:cs="Arial"/>
           <w:lang w:eastAsia="de-DE"/>
         </w:rPr>
-        <w:t xml:space="preserve"> APK, die freigegeben sind, sind gemäss der neuen Zielquote von </w:t>
-      </w:r>
-      <w:r>
-        <w:rPr>
-          <w:rFonts w:cs="Arial"/>
-        </w:rPr>
-        <w:t>&lt;&lt;[informationNote.expectedGenderPercentage]&gt;&gt;</w:t>
-      </w:r>
-      <w:r>
-        <w:rPr>
-          <w:rFonts w:cs="Arial"/>
-          <w:lang w:eastAsia="de-DE"/>
-        </w:rPr>
-        <w:t xml:space="preserve"> </w:t>
-      </w:r>
-      <w:r>
-        <w:rPr>
-          <w:rFonts w:cs="Arial"/>
-          <w:lang w:eastAsia="de-DE"/>
-        </w:rPr>
-        <w:t xml:space="preserve">% die Frauen und in </w:t>
+        <w:t xml:space="preserve"> APK</w:t>
+      </w:r>
+      <w:r>
+        <w:rPr>
+          <w:rFonts w:cs="Arial"/>
+          <w:lang w:eastAsia="de-DE"/>
+        </w:rPr>
+        <w:t>s</w:t>
+      </w:r>
+      <w:r>
+        <w:rPr>
+          <w:rFonts w:cs="Arial"/>
+          <w:lang w:eastAsia="de-DE"/>
+        </w:rPr>
+        <w:t xml:space="preserve">, die </w:t>
+      </w:r>
+      <w:r>
+        <w:rPr>
+          <w:rFonts w:cs="Arial"/>
+          <w:lang w:eastAsia="de-DE"/>
+        </w:rPr>
+        <w:t>validiert</w:t>
+      </w:r>
+      <w:r>
+        <w:rPr>
+          <w:rFonts w:cs="Arial"/>
+          <w:lang w:eastAsia="de-DE"/>
+        </w:rPr>
+        <w:t xml:space="preserve"> sind, sind die Frauen und in </w:t>
       </w:r>
       <w:r>
         <w:rPr>
@@ -2751,112 +2821,28 @@
         </w:rPr>
         <w:footnoteReference w:id="3"/>
       </w:r>
-      <w:r>
-        <w:rPr>
-          <w:rFonts w:cs="Arial"/>
-          <w:lang w:eastAsia="de-DE"/>
-        </w:rPr>
-        <w:t xml:space="preserve"> In </w:t>
-      </w:r>
-      <w:r>
-        <w:rPr>
-          <w:rFonts w:cs="Arial"/>
-        </w:rPr>
-        <w:t>&lt;&lt;[informationNote.heavyUnderst</w:t>
-      </w:r>
-      <w:r>
-        <w:rPr>
-          <w:rFonts w:cs="Arial"/>
-        </w:rPr>
-        <w:t>a</w:t>
-      </w:r>
-      <w:r>
-        <w:rPr>
-          <w:rFonts w:cs="Arial"/>
-        </w:rPr>
-        <w:t>ffedFemaleCommittees]&gt;&gt;</w:t>
-      </w:r>
-      <w:r>
-        <w:rPr>
-          <w:rFonts w:cs="Arial"/>
-          <w:lang w:eastAsia="de-DE"/>
-        </w:rPr>
-        <w:t xml:space="preserve"> Kommissionen sind die Frauen und in </w:t>
-      </w:r>
-      <w:r>
-        <w:rPr>
-          <w:rFonts w:cs="Arial"/>
-        </w:rPr>
-        <w:t>&lt;&lt;[informationNote.heavyUnderst</w:t>
-      </w:r>
-      <w:r>
-        <w:rPr>
-          <w:rFonts w:cs="Arial"/>
-        </w:rPr>
-        <w:t>a</w:t>
-      </w:r>
-      <w:r>
-        <w:rPr>
-          <w:rFonts w:cs="Arial"/>
-        </w:rPr>
-        <w:t>ffedFemaleCommittees]&gt;&gt;</w:t>
-      </w:r>
-      <w:r>
-        <w:rPr>
-          <w:rFonts w:cs="Arial"/>
-          <w:lang w:eastAsia="de-DE"/>
-        </w:rPr>
-        <w:t xml:space="preserve"> Kommission die Männer </w:t>
-      </w:r>
-      <w:r>
-        <w:rPr>
-          <w:rFonts w:cs="Arial"/>
-        </w:rPr>
-        <w:t>mit weniger als</w:t>
-      </w:r>
-      <w:r>
-        <w:rPr>
-          <w:rFonts w:cs="Arial"/>
-          <w:lang w:eastAsia="de-DE"/>
-        </w:rPr>
-        <w:t xml:space="preserve"> 30</w:t>
-      </w:r>
-      <w:r>
-        <w:rPr>
-          <w:rFonts w:cs="Arial"/>
-          <w:lang w:eastAsia="de-DE"/>
-        </w:rPr>
-        <w:t xml:space="preserve"> </w:t>
-      </w:r>
-      <w:r>
-        <w:rPr>
-          <w:rFonts w:cs="Arial"/>
-          <w:lang w:eastAsia="de-DE"/>
-        </w:rPr>
-        <w:t>% vertreten.</w:t>
-      </w:r>
-    </w:p>
-    <w:p>
-      <w:pPr>
-        <w:rPr>
-          <w:rFonts w:cs="Arial"/>
-          <w:lang w:eastAsia="de-DE"/>
-        </w:rPr>
-      </w:pPr>
-    </w:p>
-    <w:p>
-      <w:pPr>
-        <w:rPr>
-          <w:rFonts w:cs="Arial"/>
-          <w:lang w:eastAsia="de-DE"/>
-        </w:rPr>
-      </w:pPr>
-      <w:r>
-        <w:rPr>
-          <w:rFonts w:cs="Arial"/>
-          <w:lang w:eastAsia="de-DE"/>
-        </w:rPr>
-        <w:t xml:space="preserve">Im Vergleich zu den letzten Gesamterneuerungswahlen für die Amtsperiode </w:t>
+    </w:p>
+    <w:p>
+      <w:pPr>
+        <w:rPr>
+          <w:rFonts w:cs="Arial"/>
+          <w:lang w:eastAsia="de-DE"/>
+        </w:rPr>
+      </w:pPr>
+    </w:p>
+    <w:p>
+      <w:pPr>
+        <w:rPr>
+          <w:rFonts w:cs="Arial"/>
+          <w:lang w:eastAsia="de-DE"/>
+        </w:rPr>
+      </w:pPr>
+      <w:r>
+        <w:rPr>
+          <w:rFonts w:cs="Arial"/>
+          <w:lang w:eastAsia="de-DE"/>
+        </w:rPr>
+        <w:t xml:space="preserve">Die Geschlechterverteilung sah im Rahmen der letzten Gesamterneuerungswahlen für die Amtsperiode </w:t>
       </w:r>
       <w:r>
         <w:rPr>
@@ -2874,42 +2860,14 @@
         <w:rPr>
           <w:rFonts w:cs="Arial"/>
         </w:rPr>
-        <w:t>ermOfOfficeDateRange]&gt;&gt;</w:t>
-      </w:r>
-      <w:r>
-        <w:rPr>
-          <w:rFonts w:cs="Arial"/>
-          <w:lang w:eastAsia="de-DE"/>
-        </w:rPr>
-        <w:t xml:space="preserve"> lässt sich bisher (Stand </w:t>
-      </w:r>
-      <w:r>
-        <w:rPr>
-          <w:rFonts w:cs="Arial"/>
-          <w:highlight w:val="yellow"/>
-          <w:lang w:eastAsia="de-DE"/>
-        </w:rPr>
-        <w:t>31. Juli</w:t>
-      </w:r>
-      <w:r>
-        <w:rPr>
-          <w:rFonts w:cs="Arial"/>
-          <w:lang w:eastAsia="de-DE"/>
-        </w:rPr>
-        <w:t xml:space="preserve"> </w:t>
-      </w:r>
-      <w:r>
-        <w:rPr>
-          <w:rFonts w:cs="Arial"/>
-        </w:rPr>
-        <w:t>&lt;&lt;[informationNote.currentYear]&gt;&gt;</w:t>
-      </w:r>
-      <w:r>
-        <w:rPr>
-          <w:rFonts w:cs="Arial"/>
-          <w:lang w:eastAsia="de-DE"/>
-        </w:rPr>
-        <w:t>) eine Erhöhung der Vertretung der Frauen feststellen.</w:t>
+        <w:t xml:space="preserve">ermOfOfficeDateRange]&gt;&gt; </w:t>
+      </w:r>
+      <w:r>
+        <w:rPr>
+          <w:rFonts w:cs="Arial"/>
+          <w:lang w:eastAsia="de-DE"/>
+        </w:rPr>
+        <w:t>insgesamt wie folgt aus</w:t>
       </w:r>
       <w:r>
         <w:rPr>
@@ -2918,46 +2876,6 @@
           <w:lang w:eastAsia="de-DE"/>
         </w:rPr>
         <w:footnoteReference w:id="4"/>
-      </w:r>
-      <w:r>
-        <w:rPr>
-          <w:rFonts w:cs="Arial"/>
-          <w:lang w:eastAsia="de-DE"/>
-        </w:rPr>
-        <w:t xml:space="preserve"> Die Geschlechterverteilung sah im Rahmen der letzten Gesamterneuerungswahlen für die Amtsperiode </w:t>
-      </w:r>
-      <w:r>
-        <w:rPr>
-          <w:rFonts w:cs="Arial"/>
-        </w:rPr>
-        <w:t>&lt;&lt;[informationNote.</w:t>
-      </w:r>
-      <w:r>
-        <w:rPr>
-          <w:rFonts w:cs="Arial"/>
-        </w:rPr>
-        <w:t>lastT</w:t>
-      </w:r>
-      <w:r>
-        <w:rPr>
-          <w:rFonts w:cs="Arial"/>
-        </w:rPr>
-        <w:t xml:space="preserve">ermOfOfficeDateRange]&gt;&gt; </w:t>
-      </w:r>
-      <w:r>
-        <w:rPr>
-          <w:rFonts w:cs="Arial"/>
-          <w:lang w:eastAsia="de-DE"/>
-        </w:rPr>
-        <w:t>insgesamt wie folgt aus</w:t>
-      </w:r>
-      <w:r>
-        <w:rPr>
-          <w:rStyle w:val="Funotenzeichen"/>
-          <w:rFonts w:eastAsiaTheme="minorHAnsi" w:cs="Arial"/>
-          <w:lang w:eastAsia="de-DE"/>
-        </w:rPr>
-        <w:footnoteReference w:id="5"/>
       </w:r>
       <w:r>
         <w:rPr>
@@ -3042,21 +2960,29 @@
             <w:r>
               <w:rPr>
                 <w:rFonts w:cs="Arial"/>
-              </w:rPr>
-              <w:lastRenderedPageBreak/>
-              <w:t>&lt;&lt;[informationNote.</w:t>
-            </w:r>
-            <w:r>
-              <w:rPr>
-                <w:rFonts w:cs="Arial"/>
-              </w:rPr>
-              <w:t>previousFemalePercentage</w:t>
-            </w:r>
-            <w:r>
-              <w:rPr>
-                <w:rFonts w:cs="Arial"/>
-              </w:rPr>
-              <w:t>]&gt;&gt;</w:t>
+                <w:color w:val="FF0000"/>
+                <w:highlight w:val="yellow"/>
+                <w:lang w:eastAsia="de-DE"/>
+              </w:rPr>
+              <w:t>[</w:t>
+            </w:r>
+            <w:r>
+              <w:rPr>
+                <w:rFonts w:cs="Arial"/>
+                <w:color w:val="FF0000"/>
+                <w:highlight w:val="yellow"/>
+                <w:lang w:eastAsia="de-DE"/>
+              </w:rPr>
+              <w:t>Quote</w:t>
+            </w:r>
+            <w:r>
+              <w:rPr>
+                <w:rFonts w:cs="Arial"/>
+                <w:color w:val="FF0000"/>
+                <w:highlight w:val="yellow"/>
+                <w:lang w:eastAsia="de-DE"/>
+              </w:rPr>
+              <w:t>]</w:t>
             </w:r>
             <w:r>
               <w:rPr>
@@ -3080,20 +3006,29 @@
             <w:r>
               <w:rPr>
                 <w:rFonts w:cs="Arial"/>
-              </w:rPr>
-              <w:t>&lt;&lt;[informationNote.</w:t>
-            </w:r>
-            <w:r>
-              <w:rPr>
-                <w:rFonts w:cs="Arial"/>
-              </w:rPr>
-              <w:t>previousMalePercentage</w:t>
-            </w:r>
-            <w:r>
-              <w:rPr>
-                <w:rFonts w:cs="Arial"/>
-              </w:rPr>
-              <w:t>]&gt;&gt;</w:t>
+                <w:color w:val="FF0000"/>
+                <w:highlight w:val="yellow"/>
+                <w:lang w:eastAsia="de-DE"/>
+              </w:rPr>
+              <w:t>[</w:t>
+            </w:r>
+            <w:r>
+              <w:rPr>
+                <w:rFonts w:cs="Arial"/>
+                <w:color w:val="FF0000"/>
+                <w:highlight w:val="yellow"/>
+                <w:lang w:eastAsia="de-DE"/>
+              </w:rPr>
+              <w:t>Quote</w:t>
+            </w:r>
+            <w:r>
+              <w:rPr>
+                <w:rFonts w:cs="Arial"/>
+                <w:color w:val="FF0000"/>
+                <w:highlight w:val="yellow"/>
+                <w:lang w:eastAsia="de-DE"/>
+              </w:rPr>
+              <w:t>]</w:t>
             </w:r>
             <w:r>
               <w:rPr>
@@ -3131,119 +3066,152 @@
       <w:r>
         <w:rPr>
           <w:rFonts w:cs="Arial"/>
-        </w:rPr>
-        <w:t>&lt;&lt;[informationNote.</w:t>
-      </w:r>
-      <w:r>
-        <w:rPr>
-          <w:rFonts w:cs="Arial"/>
-        </w:rPr>
-        <w:t>previousHeavyUnderst</w:t>
-      </w:r>
-      <w:r>
-        <w:rPr>
-          <w:rFonts w:cs="Arial"/>
-        </w:rPr>
-        <w:t>a</w:t>
-      </w:r>
-      <w:r>
-        <w:rPr>
-          <w:rFonts w:cs="Arial"/>
-        </w:rPr>
-        <w:t>ffedFemaleCommittees</w:t>
-      </w:r>
-      <w:r>
-        <w:rPr>
-          <w:rFonts w:cs="Arial"/>
-        </w:rPr>
-        <w:t>]&gt;&gt;</w:t>
-      </w:r>
-      <w:r>
-        <w:rPr>
-          <w:rFonts w:cs="Arial"/>
-          <w:lang w:eastAsia="de-DE"/>
-        </w:rPr>
-        <w:t xml:space="preserve"> von </w:t>
-      </w:r>
-      <w:r>
-        <w:rPr>
-          <w:rFonts w:cs="Arial"/>
-        </w:rPr>
-        <w:t>&lt;&lt;[informationNote.</w:t>
-      </w:r>
-      <w:r>
-        <w:rPr>
-          <w:rFonts w:cs="Arial"/>
-        </w:rPr>
-        <w:t>previousTotalExtraParliamentaryCommittees</w:t>
-      </w:r>
-      <w:r>
-        <w:rPr>
-          <w:rFonts w:cs="Arial"/>
-        </w:rPr>
-        <w:t>]&gt;&gt;</w:t>
-      </w:r>
-      <w:r>
-        <w:rPr>
-          <w:rFonts w:cs="Arial"/>
-          <w:lang w:eastAsia="de-DE"/>
-        </w:rPr>
-        <w:t xml:space="preserve"> APK waren die Frauenquote und in </w:t>
-      </w:r>
-      <w:r>
-        <w:rPr>
-          <w:rFonts w:cs="Arial"/>
-        </w:rPr>
-        <w:t>&lt;&lt;[informationNote.</w:t>
-      </w:r>
-      <w:r>
-        <w:rPr>
-          <w:rFonts w:cs="Arial"/>
-        </w:rPr>
-        <w:t>previousHeavyUnderst</w:t>
-      </w:r>
-      <w:r>
-        <w:rPr>
-          <w:rFonts w:cs="Arial"/>
-        </w:rPr>
-        <w:t>a</w:t>
-      </w:r>
-      <w:r>
-        <w:rPr>
-          <w:rFonts w:cs="Arial"/>
-        </w:rPr>
-        <w:t>ffedMaleCommittees</w:t>
-      </w:r>
-      <w:r>
-        <w:rPr>
-          <w:rFonts w:cs="Arial"/>
-        </w:rPr>
-        <w:t>]&gt;&gt;</w:t>
-      </w:r>
-      <w:r>
-        <w:rPr>
-          <w:rFonts w:cs="Arial"/>
-          <w:lang w:eastAsia="de-DE"/>
-        </w:rPr>
-        <w:t xml:space="preserve"> die Männerquote von </w:t>
-      </w:r>
-      <w:r>
-        <w:rPr>
-          <w:rFonts w:cs="Arial"/>
-        </w:rPr>
-        <w:t>&lt;&lt;[informationNote.</w:t>
-      </w:r>
-      <w:r>
-        <w:rPr>
-          <w:rFonts w:cs="Arial"/>
-        </w:rPr>
-        <w:t>previousExpectedGenderPercentage</w:t>
-      </w:r>
-      <w:r>
-        <w:rPr>
-          <w:rFonts w:cs="Arial"/>
-        </w:rPr>
-        <w:t>]&gt;&gt;</w:t>
+          <w:color w:val="FF0000"/>
+          <w:highlight w:val="yellow"/>
+          <w:lang w:eastAsia="de-DE"/>
+        </w:rPr>
+        <w:t>[</w:t>
+      </w:r>
+      <w:r>
+        <w:rPr>
+          <w:rFonts w:cs="Arial"/>
+          <w:color w:val="FF0000"/>
+          <w:highlight w:val="yellow"/>
+          <w:lang w:eastAsia="de-DE"/>
+        </w:rPr>
+        <w:t>Anzahl Gremien</w:t>
+      </w:r>
+      <w:r>
+        <w:rPr>
+          <w:rFonts w:cs="Arial"/>
+          <w:color w:val="FF0000"/>
+          <w:highlight w:val="yellow"/>
+          <w:lang w:eastAsia="de-DE"/>
+        </w:rPr>
+        <w:t>]</w:t>
+      </w:r>
+      <w:r>
+        <w:rPr>
+          <w:rFonts w:cs="Arial"/>
+          <w:lang w:eastAsia="de-DE"/>
+        </w:rPr>
+        <w:t xml:space="preserve"> </w:t>
+      </w:r>
+      <w:r>
+        <w:rPr>
+          <w:rFonts w:cs="Arial"/>
+          <w:lang w:eastAsia="de-DE"/>
+        </w:rPr>
+        <w:t xml:space="preserve">von </w:t>
+      </w:r>
+      <w:r>
+        <w:rPr>
+          <w:rFonts w:cs="Arial"/>
+          <w:color w:val="FF0000"/>
+          <w:highlight w:val="yellow"/>
+          <w:lang w:eastAsia="de-DE"/>
+        </w:rPr>
+        <w:t>[</w:t>
+      </w:r>
+      <w:r>
+        <w:rPr>
+          <w:rFonts w:cs="Arial"/>
+          <w:color w:val="FF0000"/>
+          <w:highlight w:val="yellow"/>
+          <w:lang w:eastAsia="de-DE"/>
+        </w:rPr>
+        <w:t>Anzahl Gremien</w:t>
+      </w:r>
+      <w:r>
+        <w:rPr>
+          <w:rFonts w:cs="Arial"/>
+          <w:color w:val="FF0000"/>
+          <w:highlight w:val="yellow"/>
+          <w:lang w:eastAsia="de-DE"/>
+        </w:rPr>
+        <w:t>]</w:t>
+      </w:r>
+      <w:r>
+        <w:rPr>
+          <w:rFonts w:cs="Arial"/>
+          <w:lang w:eastAsia="de-DE"/>
+        </w:rPr>
+        <w:t xml:space="preserve"> </w:t>
+      </w:r>
+      <w:r>
+        <w:rPr>
+          <w:rFonts w:cs="Arial"/>
+          <w:lang w:eastAsia="de-DE"/>
+        </w:rPr>
+        <w:t xml:space="preserve">APK waren die Frauenquote und in </w:t>
+      </w:r>
+      <w:r>
+        <w:rPr>
+          <w:rFonts w:cs="Arial"/>
+          <w:color w:val="FF0000"/>
+          <w:highlight w:val="yellow"/>
+          <w:lang w:eastAsia="de-DE"/>
+        </w:rPr>
+        <w:t>[</w:t>
+      </w:r>
+      <w:r>
+        <w:rPr>
+          <w:rFonts w:cs="Arial"/>
+          <w:color w:val="FF0000"/>
+          <w:highlight w:val="yellow"/>
+          <w:lang w:eastAsia="de-DE"/>
+        </w:rPr>
+        <w:t>Anzahl Gremien</w:t>
+      </w:r>
+      <w:r>
+        <w:rPr>
+          <w:rFonts w:cs="Arial"/>
+          <w:color w:val="FF0000"/>
+          <w:highlight w:val="yellow"/>
+          <w:lang w:eastAsia="de-DE"/>
+        </w:rPr>
+        <w:t>]</w:t>
+      </w:r>
+      <w:r>
+        <w:rPr>
+          <w:rFonts w:cs="Arial"/>
+          <w:lang w:eastAsia="de-DE"/>
+        </w:rPr>
+        <w:t xml:space="preserve"> </w:t>
+      </w:r>
+      <w:r>
+        <w:rPr>
+          <w:rFonts w:cs="Arial"/>
+          <w:lang w:eastAsia="de-DE"/>
+        </w:rPr>
+        <w:t xml:space="preserve">die Männerquote von </w:t>
+      </w:r>
+      <w:r>
+        <w:rPr>
+          <w:rFonts w:cs="Arial"/>
+          <w:color w:val="FF0000"/>
+          <w:highlight w:val="yellow"/>
+          <w:lang w:eastAsia="de-DE"/>
+        </w:rPr>
+        <w:t>[</w:t>
+      </w:r>
+      <w:r>
+        <w:rPr>
+          <w:rFonts w:cs="Arial"/>
+          <w:color w:val="FF0000"/>
+          <w:highlight w:val="yellow"/>
+          <w:lang w:eastAsia="de-DE"/>
+        </w:rPr>
+        <w:t>Quote</w:t>
+      </w:r>
+      <w:r>
+        <w:rPr>
+          <w:rFonts w:cs="Arial"/>
+          <w:color w:val="FF0000"/>
+          <w:highlight w:val="yellow"/>
+          <w:lang w:eastAsia="de-DE"/>
+        </w:rPr>
+        <w:t>]</w:t>
       </w:r>
       <w:r>
         <w:rPr>
@@ -3385,15 +3353,48 @@
           <w:rFonts w:cs="Arial"/>
           <w:lang w:eastAsia="de-DE"/>
         </w:rPr>
-        <w:t xml:space="preserve">Insgesamt sind die Sprachen in den bis </w:t>
-      </w:r>
-      <w:r>
-        <w:rPr>
-          <w:rFonts w:cs="Arial"/>
+        <w:t>Insgesamt sind die Sprachen in den bis</w:t>
+      </w:r>
+      <w:r>
+        <w:rPr>
+          <w:rFonts w:cs="Arial"/>
+          <w:lang w:eastAsia="de-DE"/>
+        </w:rPr>
+        <w:t xml:space="preserve"> zum</w:t>
+      </w:r>
+      <w:r>
+        <w:rPr>
+          <w:rFonts w:cs="Arial"/>
+          <w:lang w:eastAsia="de-DE"/>
+        </w:rPr>
+        <w:t xml:space="preserve"> </w:t>
+      </w:r>
+      <w:r>
+        <w:rPr>
+          <w:rFonts w:cs="Arial"/>
+          <w:color w:val="FF0000"/>
           <w:highlight w:val="yellow"/>
           <w:lang w:eastAsia="de-DE"/>
         </w:rPr>
-        <w:t>31. Juli</w:t>
+        <w:t>[</w:t>
+      </w:r>
+      <w:r>
+        <w:rPr>
+          <w:rFonts w:cs="Arial"/>
+          <w:color w:val="FF0000"/>
+          <w:highlight w:val="yellow"/>
+          <w:lang w:eastAsia="de-DE"/>
+        </w:rPr>
+        <w:t>Datum</w:t>
+      </w:r>
+      <w:r>
+        <w:rPr>
+          <w:rFonts w:cs="Arial"/>
+          <w:color w:val="FF0000"/>
+          <w:highlight w:val="yellow"/>
+          <w:lang w:eastAsia="de-DE"/>
+        </w:rPr>
+        <w:t>]</w:t>
       </w:r>
       <w:r>
         <w:rPr>
@@ -3406,20 +3407,26 @@
         <w:rPr>
           <w:rFonts w:cs="Arial"/>
         </w:rPr>
-        <w:t xml:space="preserve">&lt;&lt;[informationNote.termOfOfficeDateRange]&gt;&gt; </w:t>
-      </w:r>
-      <w:r>
-        <w:rPr>
-          <w:rFonts w:cs="Arial"/>
-          <w:lang w:eastAsia="de-DE"/>
-        </w:rPr>
-        <w:t xml:space="preserve">zur Gesamterneuerungswahl freigegebenen </w:t>
-      </w:r>
-      <w:r>
-        <w:rPr>
-          <w:rFonts w:cs="Arial"/>
-        </w:rPr>
-        <w:t>APK</w:t>
+        <w:t>&lt;&lt;[informationNote.</w:t>
+      </w:r>
+      <w:r>
+        <w:rPr>
+          <w:rFonts w:cs="Arial"/>
+        </w:rPr>
+        <w:t>currentYear</w:t>
+      </w:r>
+      <w:r>
+        <w:rPr>
+          <w:rFonts w:cs="Arial"/>
+        </w:rPr>
+        <w:t xml:space="preserve">]&gt;&gt; </w:t>
+      </w:r>
+      <w:r>
+        <w:rPr>
+          <w:rFonts w:cs="Arial"/>
+          <w:lang w:eastAsia="de-DE"/>
+        </w:rPr>
+        <w:t>validierten Wahlvorschlägen</w:t>
       </w:r>
       <w:r>
         <w:rPr>
@@ -3434,7 +3441,7 @@
           <w:rFonts w:eastAsiaTheme="minorHAnsi" w:cs="Arial"/>
           <w:lang w:eastAsia="de-DE"/>
         </w:rPr>
-        <w:footnoteReference w:id="6"/>
+        <w:footnoteReference w:id="5"/>
       </w:r>
       <w:r>
         <w:rPr>
@@ -3815,7 +3822,7 @@
           <w:rFonts w:eastAsiaTheme="minorHAnsi" w:cs="Arial"/>
           <w:lang w:eastAsia="de-DE"/>
         </w:rPr>
-        <w:footnoteReference w:id="7"/>
+        <w:footnoteReference w:id="6"/>
       </w:r>
       <w:r>
         <w:rPr>
@@ -3901,7 +3908,7 @@
           <w:rFonts w:cs="Arial"/>
           <w:lang w:eastAsia="de-DE"/>
         </w:rPr>
-        <w:t xml:space="preserve">Im Vergleich zu den letzten Gesamterneuerungswahlen für die Amtsperiode </w:t>
+        <w:t xml:space="preserve">Die sprachliche Verteilung sah im Rahmen der letzten Gesamterneuerungswahlen für die Amtsperiode </w:t>
       </w:r>
       <w:r>
         <w:rPr>
@@ -3913,76 +3920,20 @@
         <w:rPr>
           <w:rFonts w:cs="Arial"/>
         </w:rPr>
-        <w:t>lastTermOfOfficeDateRange</w:t>
-      </w:r>
-      <w:r>
-        <w:rPr>
-          <w:rFonts w:cs="Arial"/>
-        </w:rPr>
-        <w:t>]&gt;&gt;</w:t>
-      </w:r>
-      <w:r>
-        <w:rPr>
-          <w:rFonts w:cs="Arial"/>
-          <w:lang w:eastAsia="de-DE"/>
-        </w:rPr>
-        <w:t xml:space="preserve"> lässt sich bisher (Stand </w:t>
-      </w:r>
-      <w:r>
-        <w:rPr>
-          <w:rFonts w:cs="Arial"/>
-          <w:highlight w:val="yellow"/>
-          <w:lang w:eastAsia="de-DE"/>
-        </w:rPr>
-        <w:t>31.</w:t>
-      </w:r>
-      <w:r>
-        <w:rPr>
-          <w:rFonts w:cs="Arial"/>
-          <w:highlight w:val="yellow"/>
-          <w:lang w:eastAsia="de-DE"/>
-        </w:rPr>
-        <w:t xml:space="preserve"> </w:t>
-      </w:r>
-      <w:r>
-        <w:rPr>
-          <w:rFonts w:cs="Arial"/>
-          <w:highlight w:val="yellow"/>
-          <w:lang w:eastAsia="de-DE"/>
-        </w:rPr>
-        <w:t>Juli</w:t>
-      </w:r>
-      <w:r>
-        <w:rPr>
-          <w:rFonts w:cs="Arial"/>
-          <w:lang w:eastAsia="de-DE"/>
-        </w:rPr>
-        <w:t xml:space="preserve"> </w:t>
-      </w:r>
-      <w:r>
-        <w:rPr>
-          <w:rFonts w:cs="Arial"/>
-        </w:rPr>
-        <w:t>&lt;&lt;[informationNote.</w:t>
-      </w:r>
-      <w:r>
-        <w:rPr>
-          <w:rFonts w:cs="Arial"/>
-        </w:rPr>
-        <w:t>currentYear</w:t>
-      </w:r>
-      <w:r>
-        <w:rPr>
-          <w:rFonts w:cs="Arial"/>
-        </w:rPr>
-        <w:t>]&gt;&gt;</w:t>
-      </w:r>
-      <w:r>
-        <w:rPr>
-          <w:rFonts w:cs="Arial"/>
-          <w:lang w:eastAsia="de-DE"/>
-        </w:rPr>
-        <w:t>) eine Erhöhung der Vertretung der Französisch- und Italienischsprachigen Personen feststellen.</w:t>
+        <w:t>lastT</w:t>
+      </w:r>
+      <w:r>
+        <w:rPr>
+          <w:rFonts w:cs="Arial"/>
+        </w:rPr>
+        <w:t>ermOfOfficeDateRange]&gt;&gt;</w:t>
+      </w:r>
+      <w:r>
+        <w:rPr>
+          <w:rFonts w:cs="Arial"/>
+          <w:lang w:eastAsia="de-DE"/>
+        </w:rPr>
+        <w:t xml:space="preserve"> insgesamt wie folgt aus</w:t>
       </w:r>
       <w:r>
         <w:rPr>
@@ -3990,47 +3941,7 @@
           <w:rFonts w:eastAsiaTheme="minorHAnsi" w:cs="Arial"/>
           <w:lang w:eastAsia="de-DE"/>
         </w:rPr>
-        <w:footnoteReference w:id="8"/>
-      </w:r>
-      <w:r>
-        <w:rPr>
-          <w:rFonts w:cs="Arial"/>
-          <w:lang w:eastAsia="de-DE"/>
-        </w:rPr>
-        <w:t xml:space="preserve"> Die sprachliche Verteilung sah im Rahmen der letzten Gesamterneuerungswahlen für die Amtsperiode </w:t>
-      </w:r>
-      <w:r>
-        <w:rPr>
-          <w:rFonts w:cs="Arial"/>
-        </w:rPr>
-        <w:t>&lt;&lt;[informationNote.</w:t>
-      </w:r>
-      <w:r>
-        <w:rPr>
-          <w:rFonts w:cs="Arial"/>
-        </w:rPr>
-        <w:t>lastT</w:t>
-      </w:r>
-      <w:r>
-        <w:rPr>
-          <w:rFonts w:cs="Arial"/>
-        </w:rPr>
-        <w:t>ermOfOfficeDateRange]&gt;&gt;</w:t>
-      </w:r>
-      <w:r>
-        <w:rPr>
-          <w:rFonts w:cs="Arial"/>
-          <w:lang w:eastAsia="de-DE"/>
-        </w:rPr>
-        <w:t xml:space="preserve"> insgesamt wie folgt aus</w:t>
-      </w:r>
-      <w:r>
-        <w:rPr>
-          <w:rStyle w:val="Funotenzeichen"/>
-          <w:rFonts w:eastAsiaTheme="minorHAnsi" w:cs="Arial"/>
-          <w:lang w:eastAsia="de-DE"/>
-        </w:rPr>
-        <w:footnoteReference w:id="9"/>
+        <w:footnoteReference w:id="7"/>
       </w:r>
       <w:r>
         <w:rPr>
@@ -4055,10 +3966,10 @@
         <w:tblLook w:val="04A0" w:firstRow="1" w:lastRow="0" w:firstColumn="1" w:lastColumn="0" w:noHBand="0" w:noVBand="1"/>
       </w:tblPr>
       <w:tblGrid>
-        <w:gridCol w:w="2265"/>
+        <w:gridCol w:w="2267"/>
         <w:gridCol w:w="2264"/>
         <w:gridCol w:w="2265"/>
-        <w:gridCol w:w="2267"/>
+        <w:gridCol w:w="2265"/>
       </w:tblGrid>
       <w:tr>
         <w:tc>
@@ -4162,20 +4073,29 @@
             <w:r>
               <w:rPr>
                 <w:rFonts w:cs="Arial"/>
-              </w:rPr>
-              <w:t>&lt;&lt;[informationNote.</w:t>
-            </w:r>
-            <w:r>
-              <w:rPr>
-                <w:rFonts w:cs="Arial"/>
-              </w:rPr>
-              <w:t>previousGermanPercentage</w:t>
-            </w:r>
-            <w:r>
-              <w:rPr>
-                <w:rFonts w:cs="Arial"/>
-              </w:rPr>
-              <w:t>]&gt;&gt;</w:t>
+                <w:color w:val="FF0000"/>
+                <w:highlight w:val="yellow"/>
+                <w:lang w:eastAsia="de-DE"/>
+              </w:rPr>
+              <w:t>[</w:t>
+            </w:r>
+            <w:r>
+              <w:rPr>
+                <w:rFonts w:cs="Arial"/>
+                <w:color w:val="FF0000"/>
+                <w:highlight w:val="yellow"/>
+                <w:lang w:eastAsia="de-DE"/>
+              </w:rPr>
+              <w:t>Quote</w:t>
+            </w:r>
+            <w:r>
+              <w:rPr>
+                <w:rFonts w:cs="Arial"/>
+                <w:color w:val="FF0000"/>
+                <w:highlight w:val="yellow"/>
+                <w:lang w:eastAsia="de-DE"/>
+              </w:rPr>
+              <w:t>]</w:t>
             </w:r>
             <w:r>
               <w:rPr>
@@ -4200,20 +4120,29 @@
             <w:r>
               <w:rPr>
                 <w:rFonts w:cs="Arial"/>
-              </w:rPr>
-              <w:t>&lt;&lt;[informationNote.</w:t>
-            </w:r>
-            <w:r>
-              <w:rPr>
-                <w:rFonts w:cs="Arial"/>
-              </w:rPr>
-              <w:t>previousFrenchPercentage</w:t>
-            </w:r>
-            <w:r>
-              <w:rPr>
-                <w:rFonts w:cs="Arial"/>
-              </w:rPr>
-              <w:t>]&gt;&gt;</w:t>
+                <w:color w:val="FF0000"/>
+                <w:highlight w:val="yellow"/>
+                <w:lang w:eastAsia="de-DE"/>
+              </w:rPr>
+              <w:t>[</w:t>
+            </w:r>
+            <w:r>
+              <w:rPr>
+                <w:rFonts w:cs="Arial"/>
+                <w:color w:val="FF0000"/>
+                <w:highlight w:val="yellow"/>
+                <w:lang w:eastAsia="de-DE"/>
+              </w:rPr>
+              <w:t>Quote</w:t>
+            </w:r>
+            <w:r>
+              <w:rPr>
+                <w:rFonts w:cs="Arial"/>
+                <w:color w:val="FF0000"/>
+                <w:highlight w:val="yellow"/>
+                <w:lang w:eastAsia="de-DE"/>
+              </w:rPr>
+              <w:t>]</w:t>
             </w:r>
             <w:r>
               <w:rPr>
@@ -4238,20 +4167,29 @@
             <w:r>
               <w:rPr>
                 <w:rFonts w:cs="Arial"/>
-              </w:rPr>
-              <w:t>&lt;&lt;[informationNote.</w:t>
-            </w:r>
-            <w:r>
-              <w:rPr>
-                <w:rFonts w:cs="Arial"/>
-              </w:rPr>
-              <w:t>previousItalianPercentage</w:t>
-            </w:r>
-            <w:r>
-              <w:rPr>
-                <w:rFonts w:cs="Arial"/>
-              </w:rPr>
-              <w:t>]&gt;&gt;</w:t>
+                <w:color w:val="FF0000"/>
+                <w:highlight w:val="yellow"/>
+                <w:lang w:eastAsia="de-DE"/>
+              </w:rPr>
+              <w:t>[</w:t>
+            </w:r>
+            <w:r>
+              <w:rPr>
+                <w:rFonts w:cs="Arial"/>
+                <w:color w:val="FF0000"/>
+                <w:highlight w:val="yellow"/>
+                <w:lang w:eastAsia="de-DE"/>
+              </w:rPr>
+              <w:t>Quote</w:t>
+            </w:r>
+            <w:r>
+              <w:rPr>
+                <w:rFonts w:cs="Arial"/>
+                <w:color w:val="FF0000"/>
+                <w:highlight w:val="yellow"/>
+                <w:lang w:eastAsia="de-DE"/>
+              </w:rPr>
+              <w:t>]</w:t>
             </w:r>
             <w:r>
               <w:rPr>
@@ -4277,20 +4215,29 @@
             <w:r>
               <w:rPr>
                 <w:rFonts w:cs="Arial"/>
-              </w:rPr>
-              <w:t>&lt;&lt;[informationNote.</w:t>
-            </w:r>
-            <w:r>
-              <w:rPr>
-                <w:rFonts w:cs="Arial"/>
-              </w:rPr>
-              <w:t>previousRomanshPercentage</w:t>
-            </w:r>
-            <w:r>
-              <w:rPr>
-                <w:rFonts w:cs="Arial"/>
-              </w:rPr>
-              <w:t>]&gt;&gt;</w:t>
+                <w:color w:val="FF0000"/>
+                <w:highlight w:val="yellow"/>
+                <w:lang w:eastAsia="de-DE"/>
+              </w:rPr>
+              <w:t>[</w:t>
+            </w:r>
+            <w:r>
+              <w:rPr>
+                <w:rFonts w:cs="Arial"/>
+                <w:color w:val="FF0000"/>
+                <w:highlight w:val="yellow"/>
+                <w:lang w:eastAsia="de-DE"/>
+              </w:rPr>
+              <w:t>Quote</w:t>
+            </w:r>
+            <w:r>
+              <w:rPr>
+                <w:rFonts w:cs="Arial"/>
+                <w:color w:val="FF0000"/>
+                <w:highlight w:val="yellow"/>
+                <w:lang w:eastAsia="de-DE"/>
+              </w:rPr>
+              <w:t>]</w:t>
             </w:r>
             <w:r>
               <w:rPr>
@@ -4323,14 +4270,34 @@
           <w:rFonts w:cs="Arial"/>
           <w:lang w:eastAsia="de-DE"/>
         </w:rPr>
-        <w:lastRenderedPageBreak/>
         <w:t xml:space="preserve">Französisch war in </w:t>
       </w:r>
       <w:r>
         <w:rPr>
           <w:rFonts w:cs="Arial"/>
-        </w:rPr>
-        <w:t>&lt;&lt;[informationNote.previousMissingFrenchCommittees]&gt;&gt;</w:t>
+          <w:color w:val="FF0000"/>
+          <w:highlight w:val="yellow"/>
+          <w:lang w:eastAsia="de-DE"/>
+        </w:rPr>
+        <w:t>[</w:t>
+      </w:r>
+      <w:r>
+        <w:rPr>
+          <w:rFonts w:cs="Arial"/>
+          <w:color w:val="FF0000"/>
+          <w:highlight w:val="yellow"/>
+          <w:lang w:eastAsia="de-DE"/>
+        </w:rPr>
+        <w:t>Anzahl</w:t>
+      </w:r>
+      <w:r>
+        <w:rPr>
+          <w:rFonts w:cs="Arial"/>
+          <w:color w:val="FF0000"/>
+          <w:highlight w:val="yellow"/>
+          <w:lang w:eastAsia="de-DE"/>
+        </w:rPr>
+        <w:t>]</w:t>
       </w:r>
       <w:r>
         <w:rPr>
@@ -4342,8 +4309,35 @@
       <w:r>
         <w:rPr>
           <w:rFonts w:cs="Arial"/>
-        </w:rPr>
-        <w:t xml:space="preserve">&lt;&lt;[informationNote.previousMissingItalianCommittees]&gt;&gt; </w:t>
+          <w:color w:val="FF0000"/>
+          <w:highlight w:val="yellow"/>
+          <w:lang w:eastAsia="de-DE"/>
+        </w:rPr>
+        <w:t>[</w:t>
+      </w:r>
+      <w:r>
+        <w:rPr>
+          <w:rFonts w:cs="Arial"/>
+          <w:color w:val="FF0000"/>
+          <w:highlight w:val="yellow"/>
+          <w:lang w:eastAsia="de-DE"/>
+        </w:rPr>
+        <w:t>Anzahl</w:t>
+      </w:r>
+      <w:r>
+        <w:rPr>
+          <w:rFonts w:cs="Arial"/>
+          <w:color w:val="FF0000"/>
+          <w:highlight w:val="yellow"/>
+          <w:lang w:eastAsia="de-DE"/>
+        </w:rPr>
+        <w:t>]</w:t>
+      </w:r>
+      <w:r>
+        <w:rPr>
+          <w:rFonts w:cs="Arial"/>
+        </w:rPr>
+        <w:t xml:space="preserve"> </w:t>
       </w:r>
       <w:r>
         <w:rPr>
@@ -4355,20 +4349,29 @@
       <w:r>
         <w:rPr>
           <w:rFonts w:cs="Arial"/>
-        </w:rPr>
-        <w:t>&lt;&lt;[informationNote.</w:t>
-      </w:r>
-      <w:r>
-        <w:rPr>
-          <w:rFonts w:cs="Arial"/>
-        </w:rPr>
-        <w:t>previousTotalExtraParliamentaryCommittees</w:t>
-      </w:r>
-      <w:r>
-        <w:rPr>
-          <w:rFonts w:cs="Arial"/>
-        </w:rPr>
-        <w:t>]&gt;&gt;</w:t>
+          <w:color w:val="FF0000"/>
+          <w:highlight w:val="yellow"/>
+          <w:lang w:eastAsia="de-DE"/>
+        </w:rPr>
+        <w:t>[</w:t>
+      </w:r>
+      <w:r>
+        <w:rPr>
+          <w:rFonts w:cs="Arial"/>
+          <w:color w:val="FF0000"/>
+          <w:highlight w:val="yellow"/>
+          <w:lang w:eastAsia="de-DE"/>
+        </w:rPr>
+        <w:t>Anzahl</w:t>
+      </w:r>
+      <w:r>
+        <w:rPr>
+          <w:rFonts w:cs="Arial"/>
+          <w:color w:val="FF0000"/>
+          <w:highlight w:val="yellow"/>
+          <w:lang w:eastAsia="de-DE"/>
+        </w:rPr>
+        <w:t>]</w:t>
       </w:r>
       <w:r>
         <w:rPr>
@@ -4380,27 +4383,42 @@
       <w:r>
         <w:rPr>
           <w:rFonts w:cs="Arial"/>
-        </w:rPr>
-        <w:t>&lt;&lt;[informationNote.</w:t>
-      </w:r>
-      <w:r>
-        <w:rPr>
-          <w:rFonts w:cs="Arial"/>
-        </w:rPr>
-        <w:t>previousMissingFrenchItalianCommittees</w:t>
-      </w:r>
-      <w:r>
-        <w:rPr>
-          <w:rFonts w:cs="Arial"/>
-        </w:rPr>
-        <w:t xml:space="preserve">]&gt;&gt; </w:t>
-      </w:r>
-      <w:r>
-        <w:rPr>
-          <w:rFonts w:cs="Arial"/>
+          <w:color w:val="FF0000"/>
           <w:highlight w:val="yellow"/>
           <w:lang w:eastAsia="de-DE"/>
         </w:rPr>
+        <w:t>[</w:t>
+      </w:r>
+      <w:r>
+        <w:rPr>
+          <w:rFonts w:cs="Arial"/>
+          <w:color w:val="FF0000"/>
+          <w:highlight w:val="yellow"/>
+          <w:lang w:eastAsia="de-DE"/>
+        </w:rPr>
+        <w:t>Anzahl</w:t>
+      </w:r>
+      <w:r>
+        <w:rPr>
+          <w:rFonts w:cs="Arial"/>
+          <w:color w:val="FF0000"/>
+          <w:highlight w:val="yellow"/>
+          <w:lang w:eastAsia="de-DE"/>
+        </w:rPr>
+        <w:t>]</w:t>
+      </w:r>
+      <w:r>
+        <w:rPr>
+          <w:rFonts w:cs="Arial"/>
+        </w:rPr>
+        <w:t xml:space="preserve"> </w:t>
+      </w:r>
+      <w:r>
+        <w:rPr>
+          <w:rFonts w:cs="Arial"/>
+          <w:highlight w:val="yellow"/>
+          <w:lang w:eastAsia="de-DE"/>
+        </w:rPr>
         <w:t>APK waren Französisch und Italienisch nicht vertreten.</w:t>
       </w:r>
       <w:r>
@@ -4408,7 +4426,41 @@
           <w:rFonts w:cs="Arial"/>
           <w:highlight w:val="green"/>
         </w:rPr>
-        <w:t xml:space="preserve"> In &lt;&lt;[informationNote.previousMissingGermanCommittees]&gt;&gt; </w:t>
+        <w:t xml:space="preserve"> In </w:t>
+      </w:r>
+      <w:r>
+        <w:rPr>
+          <w:rFonts w:cs="Arial"/>
+          <w:color w:val="FF0000"/>
+          <w:highlight w:val="yellow"/>
+          <w:lang w:eastAsia="de-DE"/>
+        </w:rPr>
+        <w:t>[</w:t>
+      </w:r>
+      <w:r>
+        <w:rPr>
+          <w:rFonts w:cs="Arial"/>
+          <w:color w:val="FF0000"/>
+          <w:highlight w:val="yellow"/>
+          <w:lang w:eastAsia="de-DE"/>
+        </w:rPr>
+        <w:t>Anzahl</w:t>
+      </w:r>
+      <w:r>
+        <w:rPr>
+          <w:rFonts w:cs="Arial"/>
+          <w:color w:val="FF0000"/>
+          <w:highlight w:val="yellow"/>
+          <w:lang w:eastAsia="de-DE"/>
+        </w:rPr>
+        <w:t>]</w:t>
+      </w:r>
+      <w:r>
+        <w:rPr>
+          <w:rFonts w:cs="Arial"/>
+          <w:highlight w:val="green"/>
+        </w:rPr>
+        <w:t xml:space="preserve"> </w:t>
       </w:r>
       <w:r>
         <w:rPr>
@@ -4472,7 +4524,7 @@
           <w:rStyle w:val="Funotenzeichen"/>
           <w:rFonts w:eastAsiaTheme="minorHAnsi" w:cs="Arial"/>
         </w:rPr>
-        <w:footnoteReference w:id="10"/>
+        <w:footnoteReference w:id="8"/>
       </w:r>
       <w:r>
         <w:rPr>
@@ -4485,7 +4537,7 @@
           <w:rStyle w:val="Funotenzeichen"/>
           <w:rFonts w:eastAsiaTheme="minorHAnsi" w:cs="Arial"/>
         </w:rPr>
-        <w:footnoteReference w:id="11"/>
+        <w:footnoteReference w:id="9"/>
       </w:r>
       <w:r>
         <w:rPr>
@@ -4529,9 +4581,29 @@
       <w:r>
         <w:rPr>
           <w:rFonts w:cs="Arial"/>
+          <w:color w:val="FF0000"/>
           <w:highlight w:val="yellow"/>
-        </w:rPr>
-        <w:t>31. Juli</w:t>
+          <w:lang w:eastAsia="de-DE"/>
+        </w:rPr>
+        <w:t>[</w:t>
+      </w:r>
+      <w:r>
+        <w:rPr>
+          <w:rFonts w:cs="Arial"/>
+          <w:color w:val="FF0000"/>
+          <w:highlight w:val="yellow"/>
+          <w:lang w:eastAsia="de-DE"/>
+        </w:rPr>
+        <w:t>Datum</w:t>
+      </w:r>
+      <w:r>
+        <w:rPr>
+          <w:rFonts w:cs="Arial"/>
+          <w:color w:val="FF0000"/>
+          <w:highlight w:val="yellow"/>
+          <w:lang w:eastAsia="de-DE"/>
+        </w:rPr>
+        <w:t>]</w:t>
       </w:r>
       <w:r>
         <w:rPr>
@@ -4616,7 +4688,7 @@
           <w:rStyle w:val="Funotenzeichen"/>
           <w:rFonts w:eastAsiaTheme="minorHAnsi" w:cs="Arial"/>
         </w:rPr>
-        <w:footnoteReference w:id="12"/>
+        <w:footnoteReference w:id="10"/>
       </w:r>
       <w:r>
         <w:rPr>
@@ -4679,15 +4751,66 @@
       <w:r>
         <w:rPr>
           <w:rFonts w:cs="Arial"/>
-          <w:lang w:eastAsia="de-DE"/>
-        </w:rPr>
-        <w:t xml:space="preserve">25. November 2020 eine neue Zielvorgabe für den Geschlechteranteil und neue Richtwerte für Landessprachen </w:t>
-      </w:r>
-      <w:r>
-        <w:rPr>
-          <w:rFonts w:cs="Arial"/>
-        </w:rPr>
-        <w:t xml:space="preserve">für die obersten Leitungsorganen der Unternehmen und Anstalten beschlossen (EXE 2020.2462). Die Richtwerte für Landessprachen und die </w:t>
+          <w:color w:val="FF0000"/>
+          <w:highlight w:val="yellow"/>
+          <w:lang w:eastAsia="de-DE"/>
+        </w:rPr>
+        <w:t>[1</w:t>
+      </w:r>
+      <w:r>
+        <w:rPr>
+          <w:rFonts w:cs="Arial"/>
+          <w:color w:val="FF0000"/>
+          <w:highlight w:val="yellow"/>
+          <w:lang w:eastAsia="de-DE"/>
+        </w:rPr>
+        <w:t>. November 202</w:t>
+      </w:r>
+      <w:r>
+        <w:rPr>
+          <w:rFonts w:cs="Arial"/>
+          <w:color w:val="FF0000"/>
+          <w:highlight w:val="yellow"/>
+          <w:lang w:eastAsia="de-DE"/>
+        </w:rPr>
+        <w:t>3]</w:t>
+      </w:r>
+      <w:r>
+        <w:rPr>
+          <w:rFonts w:cs="Arial"/>
+          <w:lang w:eastAsia="de-DE"/>
+        </w:rPr>
+        <w:t xml:space="preserve"> eine neue Zielvorgabe für den Geschlechteranteil und neue Richtwerte für Landessprachen </w:t>
+      </w:r>
+      <w:r>
+        <w:rPr>
+          <w:rFonts w:cs="Arial"/>
+        </w:rPr>
+        <w:t>für die obersten Leitungsorganen der Unternehmen und Anstalten beschlossen (EXE 202</w:t>
+      </w:r>
+      <w:r>
+        <w:rPr>
+          <w:rFonts w:cs="Arial"/>
+        </w:rPr>
+        <w:t>3</w:t>
+      </w:r>
+      <w:r>
+        <w:rPr>
+          <w:rFonts w:cs="Arial"/>
+        </w:rPr>
+        <w:t>.</w:t>
+      </w:r>
+      <w:r>
+        <w:rPr>
+          <w:rFonts w:cs="Arial"/>
+        </w:rPr>
+        <w:t>2321</w:t>
+      </w:r>
+      <w:r>
+        <w:rPr>
+          <w:rFonts w:cs="Arial"/>
+        </w:rPr>
+        <w:t xml:space="preserve">). Die Richtwerte für Landessprachen und die </w:t>
       </w:r>
       <w:r>
         <w:rPr>
@@ -5024,21 +5147,37 @@
         <w:rPr>
           <w:rFonts w:cs="Arial"/>
         </w:rPr>
-        <w:t xml:space="preserve">% für beide Geschlechter bis Ende </w:t>
-      </w:r>
-      <w:r>
-        <w:rPr>
-          <w:rFonts w:cs="Arial"/>
+        <w:t>% für beide Geschlechter</w:t>
+      </w:r>
+      <w:r>
+        <w:rPr>
+          <w:rFonts w:cs="Arial"/>
+        </w:rPr>
+        <w:t xml:space="preserve"> </w:t>
+      </w:r>
+      <w:r>
+        <w:rPr>
+          <w:rFonts w:cs="Arial"/>
+          <w:color w:val="FF0000"/>
           <w:highlight w:val="yellow"/>
         </w:rPr>
-        <w:t>20</w:t>
-      </w:r>
-      <w:r>
-        <w:rPr>
-          <w:rFonts w:cs="Arial"/>
+        <w:t xml:space="preserve">[ggf. bis Ende </w:t>
+      </w:r>
+      <w:r>
+        <w:rPr>
+          <w:rFonts w:cs="Arial"/>
+          <w:color w:val="FF0000"/>
           <w:highlight w:val="yellow"/>
         </w:rPr>
-        <w:t>31</w:t>
+        <w:t>.</w:t>
+      </w:r>
+      <w:r>
+        <w:rPr>
+          <w:rFonts w:cs="Arial"/>
+          <w:color w:val="FF0000"/>
+          <w:highlight w:val="yellow"/>
+        </w:rPr>
+        <w:t>..]</w:t>
       </w:r>
       <w:r>
         <w:rPr>
@@ -5190,14 +5329,46 @@
         <w:rPr>
           <w:rFonts w:cs="Arial"/>
         </w:rPr>
-        <w:t xml:space="preserve"> in den bis </w:t>
-      </w:r>
-      <w:r>
-        <w:rPr>
-          <w:rFonts w:cs="Arial"/>
+        <w:t xml:space="preserve"> in den bis</w:t>
+      </w:r>
+      <w:r>
+        <w:rPr>
+          <w:rFonts w:cs="Arial"/>
+        </w:rPr>
+        <w:t xml:space="preserve"> zum</w:t>
+      </w:r>
+      <w:r>
+        <w:rPr>
+          <w:rFonts w:cs="Arial"/>
+        </w:rPr>
+        <w:t xml:space="preserve"> </w:t>
+      </w:r>
+      <w:r>
+        <w:rPr>
+          <w:rFonts w:cs="Arial"/>
+          <w:color w:val="FF0000"/>
           <w:highlight w:val="yellow"/>
-        </w:rPr>
-        <w:t>31. Juli</w:t>
+          <w:lang w:eastAsia="de-DE"/>
+        </w:rPr>
+        <w:t>[</w:t>
+      </w:r>
+      <w:r>
+        <w:rPr>
+          <w:rFonts w:cs="Arial"/>
+          <w:color w:val="FF0000"/>
+          <w:highlight w:val="yellow"/>
+          <w:lang w:eastAsia="de-DE"/>
+        </w:rPr>
+        <w:t>Datum</w:t>
+      </w:r>
+      <w:r>
+        <w:rPr>
+          <w:rFonts w:cs="Arial"/>
+          <w:color w:val="FF0000"/>
+          <w:highlight w:val="yellow"/>
+          <w:lang w:eastAsia="de-DE"/>
+        </w:rPr>
+        <w:t>]</w:t>
       </w:r>
       <w:r>
         <w:rPr>
@@ -5228,20 +5399,21 @@
           <w:rFonts w:cs="Arial"/>
           <w:lang w:eastAsia="de-DE"/>
         </w:rPr>
-        <w:t xml:space="preserve"> zur Gesamterneuerungswahl freigegebenen </w:t>
-      </w:r>
-      <w:r>
-        <w:rPr>
-          <w:rFonts w:cs="Arial"/>
-        </w:rPr>
-        <w:t>Gremien</w:t>
-      </w:r>
-      <w:r>
-        <w:rPr>
-          <w:rFonts w:cs="Arial"/>
-          <w:lang w:eastAsia="de-DE"/>
-        </w:rPr>
-        <w:t xml:space="preserve"> wie folgt vertreten: </w:t>
+        <w:t xml:space="preserve"> </w:t>
+      </w:r>
+      <w:r>
+        <w:rPr>
+          <w:rFonts w:cs="Arial"/>
+          <w:lang w:eastAsia="de-DE"/>
+        </w:rPr>
+        <w:t xml:space="preserve">validierten Wahlvorschlägen </w:t>
+      </w:r>
+      <w:r>
+        <w:rPr>
+          <w:rFonts w:cs="Arial"/>
+          <w:lang w:eastAsia="de-DE"/>
+        </w:rPr>
+        <w:t xml:space="preserve">wie folgt vertreten: </w:t>
       </w:r>
     </w:p>
     <w:p>
@@ -5823,10 +5995,29 @@
       <w:r>
         <w:rPr>
           <w:rFonts w:cs="Arial"/>
+          <w:color w:val="FF0000"/>
           <w:highlight w:val="yellow"/>
           <w:lang w:eastAsia="de-DE"/>
         </w:rPr>
-        <w:t>31. Juli</w:t>
+        <w:t>[</w:t>
+      </w:r>
+      <w:r>
+        <w:rPr>
+          <w:rFonts w:cs="Arial"/>
+          <w:color w:val="FF0000"/>
+          <w:highlight w:val="yellow"/>
+          <w:lang w:eastAsia="de-DE"/>
+        </w:rPr>
+        <w:t>Datum</w:t>
+      </w:r>
+      <w:r>
+        <w:rPr>
+          <w:rFonts w:cs="Arial"/>
+          <w:color w:val="FF0000"/>
+          <w:highlight w:val="yellow"/>
+          <w:lang w:eastAsia="de-DE"/>
+        </w:rPr>
+        <w:t>]</w:t>
       </w:r>
       <w:r>
         <w:rPr>
@@ -5858,13 +6049,7 @@
           <w:rFonts w:cs="Arial"/>
           <w:lang w:eastAsia="de-DE"/>
         </w:rPr>
-        <w:t xml:space="preserve">zur Gesamterneuerungswahl freigegebenen </w:t>
-      </w:r>
-      <w:r>
-        <w:rPr>
-          <w:rFonts w:cs="Arial"/>
-        </w:rPr>
-        <w:t>Gremien</w:t>
+        <w:t>validierten Wahlvorschlägen</w:t>
       </w:r>
       <w:r>
         <w:rPr>
@@ -6039,132 +6224,149 @@
           <w:lang w:val="de-CH" w:eastAsia="de-CH"/>
         </w:rPr>
       </w:pPr>
-      <w:r>
+    </w:p>
+    <w:p>
+      <w:pPr>
+        <w:pStyle w:val="Textkrper"/>
+        <w:spacing w:after="0"/>
         <w:rPr>
           <w:rFonts w:ascii="Arial" w:eastAsia="Times New Roman" w:hAnsi="Arial" w:cs="Arial"/>
           <w:lang w:val="de-CH" w:eastAsia="de-CH"/>
         </w:rPr>
-        <w:t xml:space="preserve">In </w:t>
+      </w:pPr>
+      <w:r>
+        <w:rPr>
+          <w:rFonts w:ascii="Arial" w:eastAsia="Times New Roman" w:hAnsi="Arial" w:cs="Arial"/>
+          <w:lang w:val="de-CH" w:eastAsia="de-CH"/>
+        </w:rPr>
+        <w:lastRenderedPageBreak/>
+        <w:t xml:space="preserve">In den </w:t>
       </w:r>
       <w:r>
         <w:rPr>
           <w:rFonts w:ascii="Arial" w:hAnsi="Arial" w:cs="Arial"/>
           <w:lang w:val="de-CH"/>
         </w:rPr>
-        <w:t>&lt;&lt;[informationNote.</w:t>
+        <w:t>&lt;&lt;[informationNote.released</w:t>
       </w:r>
       <w:r>
         <w:rPr>
           <w:rFonts w:ascii="Arial" w:hAnsi="Arial" w:cs="Arial"/>
           <w:lang w:val="de-CH"/>
         </w:rPr>
-        <w:t>underst</w:t>
+        <w:t>Management</w:t>
       </w:r>
       <w:r>
         <w:rPr>
           <w:rFonts w:ascii="Arial" w:hAnsi="Arial" w:cs="Arial"/>
           <w:lang w:val="de-CH"/>
         </w:rPr>
-        <w:t>a</w:t>
+        <w:t>Committees]&gt;&gt;</w:t>
+      </w:r>
+      <w:r>
+        <w:rPr>
+          <w:rFonts w:ascii="Arial" w:eastAsia="Times New Roman" w:hAnsi="Arial" w:cs="Arial"/>
+          <w:lang w:val="de-CH" w:eastAsia="de-CH"/>
+        </w:rPr>
+        <w:t xml:space="preserve"> </w:t>
+      </w:r>
+      <w:r>
+        <w:rPr>
+          <w:rFonts w:ascii="Arial" w:eastAsia="Times New Roman" w:hAnsi="Arial" w:cs="Arial"/>
+          <w:lang w:val="de-CH" w:eastAsia="de-CH"/>
+        </w:rPr>
+        <w:t>Leitungsorganen</w:t>
+      </w:r>
+      <w:r>
+        <w:rPr>
+          <w:rFonts w:ascii="Arial" w:eastAsia="Times New Roman" w:hAnsi="Arial" w:cs="Arial"/>
+          <w:lang w:val="de-CH" w:eastAsia="de-CH"/>
+        </w:rPr>
+        <w:t xml:space="preserve">, die </w:t>
+      </w:r>
+      <w:r>
+        <w:rPr>
+          <w:rFonts w:ascii="Arial" w:eastAsia="Times New Roman" w:hAnsi="Arial" w:cs="Arial"/>
+          <w:lang w:val="de-CH" w:eastAsia="de-CH"/>
+        </w:rPr>
+        <w:t>validiert</w:t>
+      </w:r>
+      <w:r>
+        <w:rPr>
+          <w:rFonts w:ascii="Arial" w:eastAsia="Times New Roman" w:hAnsi="Arial" w:cs="Arial"/>
+          <w:lang w:val="de-CH" w:eastAsia="de-CH"/>
+        </w:rPr>
+        <w:t xml:space="preserve"> sind, sind gemäss der Zielquote </w:t>
       </w:r>
       <w:r>
         <w:rPr>
           <w:rFonts w:ascii="Arial" w:hAnsi="Arial" w:cs="Arial"/>
           <w:lang w:val="de-CH"/>
         </w:rPr>
-        <w:t>ffedFemaleManagementCommittees</w:t>
+        <w:t>von &lt;&lt;[informationNote.expectedGenderPercentage]&gt;&gt; % in</w:t>
+      </w:r>
+      <w:r>
+        <w:rPr>
+          <w:rFonts w:ascii="Arial" w:eastAsia="Times New Roman" w:hAnsi="Arial" w:cs="Arial"/>
+          <w:lang w:val="de-CH" w:eastAsia="de-CH"/>
+        </w:rPr>
+        <w:t xml:space="preserve"> </w:t>
       </w:r>
       <w:r>
         <w:rPr>
           <w:rFonts w:ascii="Arial" w:hAnsi="Arial" w:cs="Arial"/>
           <w:lang w:val="de-CH"/>
         </w:rPr>
-        <w:t>]&gt;&gt;</w:t>
+        <w:t>&lt;&lt;[informationNote.underst</w:t>
+      </w:r>
+      <w:r>
+        <w:rPr>
+          <w:rFonts w:ascii="Arial" w:hAnsi="Arial" w:cs="Arial"/>
+          <w:lang w:val="de-CH"/>
+        </w:rPr>
+        <w:t>a</w:t>
+      </w:r>
+      <w:r>
+        <w:rPr>
+          <w:rFonts w:ascii="Arial" w:hAnsi="Arial" w:cs="Arial"/>
+          <w:lang w:val="de-CH"/>
+        </w:rPr>
+        <w:t>ffedFemaleManagementCommittees]&gt;&gt;</w:t>
       </w:r>
       <w:r>
         <w:rPr>
           <w:rFonts w:ascii="Arial" w:eastAsia="Times New Roman" w:hAnsi="Arial" w:cs="Arial"/>
           <w:lang w:val="de-CH" w:eastAsia="de-CH"/>
         </w:rPr>
-        <w:t xml:space="preserve"> von </w:t>
+        <w:t xml:space="preserve"> die Frauen und in </w:t>
       </w:r>
       <w:r>
         <w:rPr>
           <w:rFonts w:ascii="Arial" w:hAnsi="Arial" w:cs="Arial"/>
           <w:lang w:val="de-CH"/>
         </w:rPr>
-        <w:t>&lt;&lt;[informationNote.</w:t>
+        <w:t>&lt;&lt;[informationNote.underst</w:t>
       </w:r>
       <w:r>
         <w:rPr>
           <w:rFonts w:ascii="Arial" w:hAnsi="Arial" w:cs="Arial"/>
           <w:lang w:val="de-CH"/>
         </w:rPr>
-        <w:t>totalManagementCommittees</w:t>
+        <w:t>a</w:t>
       </w:r>
       <w:r>
         <w:rPr>
           <w:rFonts w:ascii="Arial" w:hAnsi="Arial" w:cs="Arial"/>
           <w:lang w:val="de-CH"/>
         </w:rPr>
-        <w:t xml:space="preserve">]&gt;&gt; </w:t>
+        <w:t>ffedMaleManagementCommittees]&gt;&gt;</w:t>
       </w:r>
       <w:r>
         <w:rPr>
           <w:rFonts w:ascii="Arial" w:eastAsia="Times New Roman" w:hAnsi="Arial" w:cs="Arial"/>
           <w:lang w:val="de-CH" w:eastAsia="de-CH"/>
         </w:rPr>
-        <w:t>Leitungsorgane</w:t>
-      </w:r>
-      <w:r>
-        <w:rPr>
-          <w:rFonts w:ascii="Arial" w:eastAsia="Times New Roman" w:hAnsi="Arial" w:cs="Arial"/>
-          <w:lang w:val="de-CH" w:eastAsia="de-CH"/>
-        </w:rPr>
-        <w:t>n</w:t>
-      </w:r>
-      <w:r>
-        <w:rPr>
-          <w:rFonts w:ascii="Arial" w:eastAsia="Times New Roman" w:hAnsi="Arial" w:cs="Arial"/>
-          <w:lang w:val="de-CH" w:eastAsia="de-CH"/>
-        </w:rPr>
-        <w:t xml:space="preserve">, die freigegeben sind, </w:t>
-      </w:r>
-      <w:r>
-        <w:rPr>
-          <w:rFonts w:ascii="Arial" w:eastAsia="Times New Roman" w:hAnsi="Arial" w:cs="Arial"/>
-          <w:lang w:val="de-CH" w:eastAsia="de-CH"/>
-        </w:rPr>
-        <w:lastRenderedPageBreak/>
-        <w:t xml:space="preserve">sind gemäss der Zielquote von </w:t>
-      </w:r>
-      <w:r>
-        <w:rPr>
-          <w:rFonts w:ascii="Arial" w:eastAsia="Times New Roman" w:hAnsi="Arial" w:cs="Arial"/>
-          <w:lang w:val="de-CH" w:eastAsia="de-CH"/>
-        </w:rPr>
-        <w:t>&lt;&lt;[informationNote.expectedGenderPercentage]&gt;&gt;</w:t>
-      </w:r>
-      <w:r>
-        <w:rPr>
-          <w:rFonts w:ascii="Arial" w:eastAsia="Times New Roman" w:hAnsi="Arial" w:cs="Arial"/>
-          <w:lang w:val="de-CH" w:eastAsia="de-CH"/>
-        </w:rPr>
-        <w:t xml:space="preserve"> </w:t>
-      </w:r>
-      <w:r>
-        <w:rPr>
-          <w:rFonts w:ascii="Arial" w:eastAsia="Times New Roman" w:hAnsi="Arial" w:cs="Arial"/>
-          <w:lang w:val="de-CH" w:eastAsia="de-CH"/>
-        </w:rPr>
-        <w:t>% die Frauen untervertreten.</w:t>
-      </w:r>
-      <w:r>
-        <w:rPr>
-          <w:rFonts w:ascii="Arial" w:eastAsia="Times New Roman" w:hAnsi="Arial" w:cs="Arial"/>
-          <w:lang w:val="de-CH" w:eastAsia="de-CH"/>
-        </w:rPr>
-        <w:footnoteReference w:id="13"/>
+        <w:t xml:space="preserve"> die Männer untervertreten.</w:t>
       </w:r>
     </w:p>
     <w:p>
@@ -6324,127 +6526,169 @@
       </w:r>
       <w:r>
         <w:rPr>
-          <w:rFonts w:ascii="Arial" w:hAnsi="Arial" w:cs="Arial"/>
-          <w:lang w:val="de-CH"/>
-        </w:rPr>
-        <w:t>&lt;&lt;[informationNote.</w:t>
-      </w:r>
-      <w:r>
-        <w:rPr>
-          <w:rFonts w:ascii="Arial" w:hAnsi="Arial" w:cs="Arial"/>
-          <w:lang w:val="de-CH"/>
-        </w:rPr>
-        <w:t>releasedFederalAgenciesCommittees</w:t>
-      </w:r>
-      <w:r>
-        <w:rPr>
-          <w:rFonts w:ascii="Arial" w:hAnsi="Arial" w:cs="Arial"/>
-          <w:lang w:val="de-CH"/>
-        </w:rPr>
-        <w:t>]&gt;&gt;</w:t>
-      </w:r>
-      <w:r>
-        <w:rPr>
           <w:rFonts w:ascii="Arial" w:eastAsia="Times New Roman" w:hAnsi="Arial" w:cs="Arial"/>
           <w:lang w:val="de-CH" w:eastAsia="de-CH"/>
         </w:rPr>
-        <w:t xml:space="preserve"> Vertretungen des Bundes, die freigegeben sind, sind gemäss der Zielquote </w:t>
-      </w:r>
-      <w:r>
-        <w:rPr>
-          <w:rFonts w:ascii="Arial" w:hAnsi="Arial" w:cs="Arial"/>
-          <w:lang w:val="de-CH"/>
-        </w:rPr>
-        <w:t xml:space="preserve">von </w:t>
-      </w:r>
-      <w:r>
-        <w:rPr>
-          <w:rFonts w:ascii="Arial" w:hAnsi="Arial" w:cs="Arial"/>
-          <w:lang w:val="de-CH"/>
-        </w:rPr>
-        <w:t>&lt;&lt;[informationNote.expectedGenderPercentage]&gt;&gt;</w:t>
-      </w:r>
-      <w:r>
-        <w:rPr>
-          <w:rFonts w:ascii="Arial" w:hAnsi="Arial" w:cs="Arial"/>
-          <w:lang w:val="de-CH"/>
-        </w:rPr>
-        <w:t xml:space="preserve"> </w:t>
-      </w:r>
-      <w:r>
-        <w:rPr>
-          <w:rFonts w:ascii="Arial" w:hAnsi="Arial" w:cs="Arial"/>
-          <w:lang w:val="de-CH"/>
-        </w:rPr>
-        <w:t>% in</w:t>
+        <w:t>&lt;&lt;[informationNote.</w:t>
       </w:r>
       <w:r>
         <w:rPr>
           <w:rFonts w:ascii="Arial" w:eastAsia="Times New Roman" w:hAnsi="Arial" w:cs="Arial"/>
           <w:lang w:val="de-CH" w:eastAsia="de-CH"/>
         </w:rPr>
-        <w:t xml:space="preserve"> </w:t>
-      </w:r>
-      <w:r>
-        <w:rPr>
-          <w:rFonts w:ascii="Arial" w:hAnsi="Arial" w:cs="Arial"/>
-          <w:lang w:val="de-CH"/>
-        </w:rPr>
-        <w:t>&lt;&lt;[informationNote.underst</w:t>
-      </w:r>
-      <w:r>
-        <w:rPr>
-          <w:rFonts w:ascii="Arial" w:hAnsi="Arial" w:cs="Arial"/>
-          <w:lang w:val="de-CH"/>
-        </w:rPr>
-        <w:t>a</w:t>
-      </w:r>
-      <w:r>
-        <w:rPr>
-          <w:rFonts w:ascii="Arial" w:hAnsi="Arial" w:cs="Arial"/>
-          <w:lang w:val="de-CH"/>
-        </w:rPr>
-        <w:t>ffedFemaleManagementCommittees]&gt;&gt;</w:t>
+        <w:t>releasedFederalAgenciesCommittees</w:t>
       </w:r>
       <w:r>
         <w:rPr>
           <w:rFonts w:ascii="Arial" w:eastAsia="Times New Roman" w:hAnsi="Arial" w:cs="Arial"/>
           <w:lang w:val="de-CH" w:eastAsia="de-CH"/>
         </w:rPr>
+        <w:t>]&gt;&gt;</w:t>
+      </w:r>
+      <w:r>
+        <w:rPr>
+          <w:rFonts w:ascii="Arial" w:eastAsia="Times New Roman" w:hAnsi="Arial" w:cs="Arial"/>
+          <w:lang w:val="de-CH" w:eastAsia="de-CH"/>
+        </w:rPr>
+        <w:t xml:space="preserve"> Vertretungen des Bundes, die </w:t>
+      </w:r>
+      <w:r>
+        <w:rPr>
+          <w:rFonts w:ascii="Arial" w:eastAsia="Times New Roman" w:hAnsi="Arial" w:cs="Arial"/>
+          <w:lang w:val="de-CH" w:eastAsia="de-CH"/>
+        </w:rPr>
+        <w:t>validiert</w:t>
+      </w:r>
+      <w:r>
+        <w:rPr>
+          <w:rFonts w:ascii="Arial" w:eastAsia="Times New Roman" w:hAnsi="Arial" w:cs="Arial"/>
+          <w:lang w:val="de-CH" w:eastAsia="de-CH"/>
+        </w:rPr>
+        <w:t xml:space="preserve"> sind, sind gemäss der Zielquote </w:t>
+      </w:r>
+      <w:r>
+        <w:rPr>
+          <w:rFonts w:ascii="Arial" w:eastAsia="Times New Roman" w:hAnsi="Arial" w:cs="Arial"/>
+          <w:lang w:val="de-CH" w:eastAsia="de-CH"/>
+        </w:rPr>
+        <w:t xml:space="preserve">von </w:t>
+      </w:r>
+      <w:r>
+        <w:rPr>
+          <w:rFonts w:ascii="Arial" w:eastAsia="Times New Roman" w:hAnsi="Arial" w:cs="Arial"/>
+          <w:lang w:val="de-CH" w:eastAsia="de-CH"/>
+        </w:rPr>
+        <w:t>&lt;&lt;[informationNote.expectedGenderPercentage]&gt;&gt;</w:t>
+      </w:r>
+      <w:r>
+        <w:rPr>
+          <w:rFonts w:ascii="Arial" w:eastAsia="Times New Roman" w:hAnsi="Arial" w:cs="Arial"/>
+          <w:lang w:val="de-CH" w:eastAsia="de-CH"/>
+        </w:rPr>
+        <w:t xml:space="preserve"> </w:t>
+      </w:r>
+      <w:r>
+        <w:rPr>
+          <w:rFonts w:ascii="Arial" w:eastAsia="Times New Roman" w:hAnsi="Arial" w:cs="Arial"/>
+          <w:lang w:val="de-CH" w:eastAsia="de-CH"/>
+        </w:rPr>
+        <w:t>% in</w:t>
+      </w:r>
+      <w:r>
+        <w:rPr>
+          <w:rFonts w:ascii="Arial" w:eastAsia="Times New Roman" w:hAnsi="Arial" w:cs="Arial"/>
+          <w:lang w:val="de-CH" w:eastAsia="de-CH"/>
+        </w:rPr>
+        <w:t xml:space="preserve"> </w:t>
+      </w:r>
+      <w:r>
+        <w:rPr>
+          <w:rFonts w:ascii="Arial" w:eastAsia="Times New Roman" w:hAnsi="Arial" w:cs="Arial"/>
+          <w:lang w:val="de-CH" w:eastAsia="de-CH"/>
+        </w:rPr>
+        <w:t>&lt;&lt;[informationNote.underst</w:t>
+      </w:r>
+      <w:r>
+        <w:rPr>
+          <w:rFonts w:ascii="Arial" w:eastAsia="Times New Roman" w:hAnsi="Arial" w:cs="Arial"/>
+          <w:lang w:val="de-CH" w:eastAsia="de-CH"/>
+        </w:rPr>
+        <w:t>a</w:t>
+      </w:r>
+      <w:r>
+        <w:rPr>
+          <w:rFonts w:ascii="Arial" w:eastAsia="Times New Roman" w:hAnsi="Arial" w:cs="Arial"/>
+          <w:lang w:val="de-CH" w:eastAsia="de-CH"/>
+        </w:rPr>
+        <w:t>ffedFemale</w:t>
+      </w:r>
+      <w:r>
+        <w:rPr>
+          <w:rFonts w:ascii="Arial" w:eastAsia="Times New Roman" w:hAnsi="Arial" w:cs="Arial"/>
+          <w:lang w:val="de-CH" w:eastAsia="de-CH"/>
+        </w:rPr>
+        <w:t>FederalAgencies</w:t>
+      </w:r>
+      <w:r>
+        <w:rPr>
+          <w:rFonts w:ascii="Arial" w:eastAsia="Times New Roman" w:hAnsi="Arial" w:cs="Arial"/>
+          <w:lang w:val="de-CH" w:eastAsia="de-CH"/>
+        </w:rPr>
+        <w:t>Committees]&gt;&gt;</w:t>
+      </w:r>
+      <w:r>
+        <w:rPr>
+          <w:rFonts w:ascii="Arial" w:eastAsia="Times New Roman" w:hAnsi="Arial" w:cs="Arial"/>
+          <w:lang w:val="de-CH" w:eastAsia="de-CH"/>
+        </w:rPr>
         <w:t xml:space="preserve"> die Frauen und in </w:t>
       </w:r>
       <w:r>
         <w:rPr>
-          <w:rFonts w:ascii="Arial" w:hAnsi="Arial" w:cs="Arial"/>
-          <w:lang w:val="de-CH"/>
+          <w:rFonts w:ascii="Arial" w:eastAsia="Times New Roman" w:hAnsi="Arial" w:cs="Arial"/>
+          <w:lang w:val="de-CH" w:eastAsia="de-CH"/>
         </w:rPr>
         <w:t>&lt;&lt;[informationNote.</w:t>
       </w:r>
       <w:r>
         <w:rPr>
-          <w:rFonts w:ascii="Arial" w:hAnsi="Arial" w:cs="Arial"/>
-          <w:lang w:val="de-CH"/>
+          <w:rFonts w:ascii="Arial" w:eastAsia="Times New Roman" w:hAnsi="Arial" w:cs="Arial"/>
+          <w:lang w:val="de-CH" w:eastAsia="de-CH"/>
         </w:rPr>
         <w:t>underst</w:t>
       </w:r>
       <w:r>
         <w:rPr>
-          <w:rFonts w:ascii="Arial" w:hAnsi="Arial" w:cs="Arial"/>
-          <w:lang w:val="de-CH"/>
+          <w:rFonts w:ascii="Arial" w:eastAsia="Times New Roman" w:hAnsi="Arial" w:cs="Arial"/>
+          <w:lang w:val="de-CH" w:eastAsia="de-CH"/>
         </w:rPr>
         <w:t>a</w:t>
       </w:r>
       <w:r>
         <w:rPr>
-          <w:rFonts w:ascii="Arial" w:hAnsi="Arial" w:cs="Arial"/>
-          <w:lang w:val="de-CH"/>
-        </w:rPr>
-        <w:t>ffedMaleManagementCommittees</w:t>
-      </w:r>
-      <w:r>
-        <w:rPr>
-          <w:rFonts w:ascii="Arial" w:hAnsi="Arial" w:cs="Arial"/>
-          <w:lang w:val="de-CH"/>
+          <w:rFonts w:ascii="Arial" w:eastAsia="Times New Roman" w:hAnsi="Arial" w:cs="Arial"/>
+          <w:lang w:val="de-CH" w:eastAsia="de-CH"/>
+        </w:rPr>
+        <w:t>ffedMale</w:t>
+      </w:r>
+      <w:r>
+        <w:rPr>
+          <w:rFonts w:ascii="Arial" w:eastAsia="Times New Roman" w:hAnsi="Arial" w:cs="Arial"/>
+          <w:lang w:val="de-CH" w:eastAsia="de-CH"/>
+        </w:rPr>
+        <w:t>FederalAgencies</w:t>
+      </w:r>
+      <w:r>
+        <w:rPr>
+          <w:rFonts w:ascii="Arial" w:eastAsia="Times New Roman" w:hAnsi="Arial" w:cs="Arial"/>
+          <w:lang w:val="de-CH" w:eastAsia="de-CH"/>
+        </w:rPr>
+        <w:t>Committees</w:t>
+      </w:r>
+      <w:r>
+        <w:rPr>
+          <w:rFonts w:ascii="Arial" w:eastAsia="Times New Roman" w:hAnsi="Arial" w:cs="Arial"/>
+          <w:lang w:val="de-CH" w:eastAsia="de-CH"/>
         </w:rPr>
         <w:t>]&gt;&gt;</w:t>
       </w:r>
@@ -6549,7 +6793,19 @@
         <w:rPr>
           <w:rFonts w:cs="Arial"/>
         </w:rPr>
-        <w:t>Es werden nur Gremien berücksichtigt, die für die Gesamterneuerungswahl freigegeben wurden.</w:t>
+        <w:t xml:space="preserve">Es werden nur Gremien berücksichtigt, </w:t>
+      </w:r>
+      <w:r>
+        <w:rPr>
+          <w:rFonts w:cs="Arial"/>
+        </w:rPr>
+        <w:t>deren Wahlvorschläge validiert sind</w:t>
+      </w:r>
+      <w:r>
+        <w:rPr>
+          <w:rFonts w:cs="Arial"/>
+        </w:rPr>
+        <w:t>.</w:t>
       </w:r>
       <w:bookmarkEnd w:id="3"/>
     </w:p>
@@ -7144,7 +7400,34 @@
         <w:pStyle w:val="Default"/>
       </w:pPr>
       <w:r>
-        <w:t xml:space="preserve">Die Departemente erfassen alle noch vakanten Wahlanträge bis spätestens am 31. August 2023. Der Entwurf des Antrags an den Bundesrat </w:t>
+        <w:t xml:space="preserve">Die Departemente erfassen alle noch vakanten Wahlanträge bis spätestens am </w:t>
+      </w:r>
+      <w:r>
+        <w:rPr>
+          <w:color w:val="FF0000"/>
+          <w:highlight w:val="yellow"/>
+          <w:lang w:eastAsia="de-DE"/>
+        </w:rPr>
+        <w:t>[</w:t>
+      </w:r>
+      <w:r>
+        <w:rPr>
+          <w:color w:val="FF0000"/>
+          <w:highlight w:val="yellow"/>
+          <w:lang w:eastAsia="de-DE"/>
+        </w:rPr>
+        <w:t>Datum</w:t>
+      </w:r>
+      <w:r>
+        <w:rPr>
+          <w:color w:val="FF0000"/>
+          <w:highlight w:val="yellow"/>
+          <w:lang w:eastAsia="de-DE"/>
+        </w:rPr>
+        <w:t>]</w:t>
+      </w:r>
+      <w:r>
+        <w:t xml:space="preserve">. Der Entwurf des Antrags an den Bundesrat </w:t>
       </w:r>
       <w:r>
         <w:rPr>
@@ -7172,39 +7455,69 @@
       </w:r>
       <w:r>
         <w:rPr>
+          <w:color w:val="FF0000"/>
           <w:highlight w:val="yellow"/>
-        </w:rPr>
-        <w:t>30.</w:t>
-      </w:r>
-      <w:r>
-        <w:rPr>
+          <w:lang w:eastAsia="de-DE"/>
+        </w:rPr>
+        <w:t>[</w:t>
+      </w:r>
+      <w:r>
+        <w:rPr>
+          <w:color w:val="FF0000"/>
           <w:highlight w:val="yellow"/>
-        </w:rPr>
+          <w:lang w:eastAsia="de-DE"/>
+        </w:rPr>
+        <w:t>Datum</w:t>
+      </w:r>
+      <w:r>
+        <w:rPr>
+          <w:color w:val="FF0000"/>
+          <w:highlight w:val="yellow"/>
+          <w:lang w:eastAsia="de-DE"/>
+        </w:rPr>
+        <w:t>]</w:t>
+      </w:r>
+      <w:r>
+        <w:t xml:space="preserve"> unterbreitet. Die BK unterbreitet den Antrag voraussichtlich am </w:t>
+      </w:r>
+      <w:r>
+        <w:rPr>
+          <w:color w:val="FF0000"/>
+          <w:highlight w:val="yellow"/>
+          <w:lang w:eastAsia="de-DE"/>
+        </w:rPr>
+        <w:t>[</w:t>
+      </w:r>
+      <w:r>
+        <w:rPr>
+          <w:color w:val="FF0000"/>
+          <w:highlight w:val="yellow"/>
+          <w:lang w:eastAsia="de-DE"/>
+        </w:rPr>
+        <w:t>Datum</w:t>
+      </w:r>
+      <w:r>
+        <w:rPr>
+          <w:color w:val="FF0000"/>
+          <w:highlight w:val="yellow"/>
+          <w:lang w:eastAsia="de-DE"/>
+        </w:rPr>
+        <w:t>]</w:t>
+      </w:r>
+      <w:r>
+        <w:t xml:space="preserve"> dem Bundesrat zur Verabschiedung. Parallel zur GSK-Sitzung werden gemäss Entscheid des Bundesrates vom 4.</w:t>
+      </w:r>
+      <w:r>
         <w:t xml:space="preserve"> </w:t>
       </w:r>
       <w:r>
+        <w:t xml:space="preserve">Mai 2016 (EXE 2016.0261) folgende Stellen konsultiert: BJ, EFV, EPA, EBG, Delegierte für Mehrsprachigkeit. </w:t>
+      </w:r>
+      <w:r>
         <w:rPr>
           <w:highlight w:val="yellow"/>
         </w:rPr>
-        <w:t>Oktober 2023</w:t>
-      </w:r>
-      <w:r>
-        <w:t xml:space="preserve"> unterbreitet. Die BK unterbreitet den Antrag voraussichtlich am </w:t>
-      </w:r>
-      <w:r>
-        <w:rPr>
-          <w:highlight w:val="yellow"/>
-        </w:rPr>
-        <w:t>22. November 2023</w:t>
-      </w:r>
-      <w:r>
-        <w:t xml:space="preserve"> dem Bundesrat zur Verabschiedung. Parallel zur GSK-Sitzung werden gemäss Entscheid des Bundesrates vom 4.</w:t>
-      </w:r>
-      <w:r>
-        <w:t xml:space="preserve"> </w:t>
-      </w:r>
-      <w:r>
-        <w:t>Mai 2016 (EXE 2016.0261) folgende Stellen konsultiert: BJ, EFV, EPA, EBG, Delegierte für Mehrsprachigkeit. Es ist keine weitere Ämterkonsultation vorgesehen, da der Antrag auf den Meldungen der Departemente basiert.</w:t>
+        <w:t>Es ist keine weitere Ämterkonsultation vorgesehen, da der Antrag auf den Meldungen der Departemente basiert.</w:t>
       </w:r>
     </w:p>
     <w:p>
@@ -7341,6 +7654,7 @@
         <w:rPr>
           <w:rFonts w:cs="Arial"/>
         </w:rPr>
+        <w:lastRenderedPageBreak/>
         <w:t>Viktor Rossi</w:t>
       </w:r>
     </w:p>
@@ -7518,7 +7832,14 @@
           <w:rFonts w:cs="Arial"/>
           <w:lang w:val="en-US"/>
         </w:rPr>
-        <w:t>Keine Kommission</w:t>
+        <w:t xml:space="preserve">Keine </w:t>
+      </w:r>
+      <w:r>
+        <w:rPr>
+          <w:rFonts w:cs="Arial"/>
+          <w:lang w:val="en-US"/>
+        </w:rPr>
+        <w:t>Gremien</w:t>
       </w:r>
       <w:r>
         <w:rPr>
@@ -7725,14 +8046,34 @@
       <w:r>
         <w:rPr>
           <w:rFonts w:cs="Arial"/>
+          <w:color w:val="FF0000"/>
           <w:highlight w:val="yellow"/>
           <w:lang w:eastAsia="de-DE"/>
         </w:rPr>
-        <w:t>31. Juli</w:t>
-      </w:r>
-      <w:r>
-        <w:rPr>
-          <w:rFonts w:cs="Arial"/>
+        <w:t>[</w:t>
+      </w:r>
+      <w:r>
+        <w:rPr>
+          <w:rFonts w:cs="Arial"/>
+          <w:color w:val="FF0000"/>
+          <w:highlight w:val="yellow"/>
+          <w:lang w:eastAsia="de-DE"/>
+        </w:rPr>
+        <w:t>Datum</w:t>
+      </w:r>
+      <w:r>
+        <w:rPr>
+          <w:rFonts w:cs="Arial"/>
+          <w:color w:val="FF0000"/>
+          <w:highlight w:val="yellow"/>
+          <w:lang w:eastAsia="de-DE"/>
+        </w:rPr>
+        <w:t>]</w:t>
+      </w:r>
+      <w:r>
+        <w:rPr>
+          <w:rFonts w:cs="Arial"/>
+          <w:color w:val="FF0000"/>
           <w:lang w:eastAsia="de-DE"/>
         </w:rPr>
         <w:t xml:space="preserve"> </w:t>
@@ -7754,7 +8095,13 @@
         <w:rPr>
           <w:rFonts w:cs="Arial"/>
         </w:rPr>
-        <w:t>freigegeben werden:</w:t>
+        <w:t>validiert</w:t>
+      </w:r>
+      <w:r>
+        <w:rPr>
+          <w:rFonts w:cs="Arial"/>
+        </w:rPr>
+        <w:t xml:space="preserve"> werden:</w:t>
       </w:r>
     </w:p>
     <w:p>
@@ -7830,7 +8177,14 @@
           <w:rFonts w:cs="Arial"/>
           <w:lang w:val="en-US"/>
         </w:rPr>
-        <w:t>Keine Kommission</w:t>
+        <w:t xml:space="preserve">Keine </w:t>
+      </w:r>
+      <w:r>
+        <w:rPr>
+          <w:rFonts w:cs="Arial"/>
+          <w:lang w:val="en-US"/>
+        </w:rPr>
+        <w:t>Gremien</w:t>
       </w:r>
       <w:r>
         <w:rPr>
@@ -8140,7 +8494,14 @@
           <w:rFonts w:cs="Arial"/>
           <w:lang w:val="en-US"/>
         </w:rPr>
-        <w:t>Keine Kommission</w:t>
+        <w:t xml:space="preserve">Keine </w:t>
+      </w:r>
+      <w:r>
+        <w:rPr>
+          <w:rFonts w:cs="Arial"/>
+          <w:lang w:val="en-US"/>
+        </w:rPr>
+        <w:t>Gremien</w:t>
       </w:r>
       <w:r>
         <w:rPr>
@@ -8401,7 +8762,14 @@
           <w:rFonts w:cs="Arial"/>
           <w:lang w:val="en-US"/>
         </w:rPr>
-        <w:t>Keine Kommission</w:t>
+        <w:t xml:space="preserve">Keine </w:t>
+      </w:r>
+      <w:r>
+        <w:rPr>
+          <w:rFonts w:cs="Arial"/>
+          <w:lang w:val="en-US"/>
+        </w:rPr>
+        <w:t>Gremien</w:t>
       </w:r>
       <w:r>
         <w:rPr>
@@ -8641,7 +9009,14 @@
           <w:rFonts w:cs="Arial"/>
           <w:lang w:val="en-US"/>
         </w:rPr>
-        <w:t>Keine Kommission</w:t>
+        <w:t xml:space="preserve">Keine </w:t>
+      </w:r>
+      <w:r>
+        <w:rPr>
+          <w:rFonts w:cs="Arial"/>
+          <w:lang w:val="en-US"/>
+        </w:rPr>
+        <w:t>Gremien</w:t>
       </w:r>
       <w:r>
         <w:rPr>
@@ -8799,7 +9174,7 @@
           <w:rFonts w:eastAsiaTheme="minorHAnsi" w:cs="Arial"/>
           <w:szCs w:val="24"/>
         </w:rPr>
-        <w:footnoteReference w:id="14"/>
+        <w:footnoteReference w:id="11"/>
       </w:r>
     </w:p>
     <w:p>
@@ -9067,15 +9442,34 @@
           <w:rFonts w:cs="Arial"/>
           <w:szCs w:val="24"/>
         </w:rPr>
-        <w:t xml:space="preserve">Mindestens &lt;&lt;[informationNote.minimalFemaleThreshold]&gt;&gt; % für beide Geschlechter bis Ende </w:t>
-      </w:r>
-      <w:r>
-        <w:rPr>
-          <w:rFonts w:cs="Arial"/>
-          <w:szCs w:val="24"/>
+        <w:t xml:space="preserve">Mindestens &lt;&lt;[informationNote.minimalFemaleThreshold]&gt;&gt; % für beide Geschlechter </w:t>
+      </w:r>
+      <w:r>
+        <w:rPr>
+          <w:rFonts w:cs="Arial"/>
+          <w:color w:val="FF0000"/>
           <w:highlight w:val="yellow"/>
-        </w:rPr>
-        <w:t>2031</w:t>
+          <w:lang w:eastAsia="de-DE"/>
+        </w:rPr>
+        <w:t>[</w:t>
+      </w:r>
+      <w:r>
+        <w:rPr>
+          <w:rFonts w:cs="Arial"/>
+          <w:color w:val="FF0000"/>
+          <w:highlight w:val="yellow"/>
+          <w:lang w:eastAsia="de-DE"/>
+        </w:rPr>
+        <w:t>ggf. bis Ende …</w:t>
+      </w:r>
+      <w:r>
+        <w:rPr>
+          <w:rFonts w:cs="Arial"/>
+          <w:color w:val="FF0000"/>
+          <w:highlight w:val="yellow"/>
+          <w:lang w:eastAsia="de-DE"/>
+        </w:rPr>
+        <w:t>]</w:t>
       </w:r>
       <w:r>
         <w:rPr>
@@ -9147,7 +9541,14 @@
           <w:rFonts w:cs="Arial"/>
           <w:lang w:val="en-US"/>
         </w:rPr>
-        <w:t>Keine Kommission</w:t>
+        <w:t xml:space="preserve">Keine </w:t>
+      </w:r>
+      <w:r>
+        <w:rPr>
+          <w:rFonts w:cs="Arial"/>
+          <w:lang w:val="en-US"/>
+        </w:rPr>
+        <w:t>Gremien</w:t>
       </w:r>
       <w:r>
         <w:rPr>
@@ -9682,7 +10083,7 @@
           <w:rFonts w:eastAsiaTheme="minorHAnsi" w:cs="Arial"/>
           <w:b/>
         </w:rPr>
-        <w:footnoteReference w:id="15"/>
+        <w:footnoteReference w:id="12"/>
       </w:r>
     </w:p>
     <w:tbl>
@@ -10491,9 +10892,54 @@
           <w:rFonts w:cs="Arial"/>
           <w:sz w:val="16"/>
           <w:szCs w:val="16"/>
-          <w:lang w:eastAsia="de-DE"/>
-        </w:rPr>
-        <w:t>Da noch Wahlanträge ausstehend sind, lassen sich noch keine definitiven Schlüsse ziehen.</w:t>
+        </w:rPr>
+        <w:t>Bericht vom 29. April 2020 über die Gesamterneuerung der ausserparlamentarischen Kommissionen, Leitungsorgane und Vertretungen des Bundes durch den Bundesrat für die Amtsperiode 2020–2023</w:t>
+      </w:r>
+      <w:r>
+        <w:rPr>
+          <w:rFonts w:cs="Arial"/>
+          <w:sz w:val="16"/>
+          <w:szCs w:val="16"/>
+          <w:lang w:eastAsia="de-DE"/>
+        </w:rPr>
+        <w:t xml:space="preserve">; BBl </w:t>
+      </w:r>
+      <w:r>
+        <w:rPr>
+          <w:rFonts w:cs="Arial"/>
+          <w:i/>
+          <w:sz w:val="16"/>
+          <w:szCs w:val="16"/>
+          <w:lang w:eastAsia="de-DE"/>
+        </w:rPr>
+        <w:t>2020</w:t>
+      </w:r>
+      <w:r>
+        <w:rPr>
+          <w:rFonts w:cs="Arial"/>
+          <w:sz w:val="16"/>
+          <w:szCs w:val="16"/>
+          <w:lang w:eastAsia="de-DE"/>
+        </w:rPr>
+        <w:t xml:space="preserve"> 4549 S. </w:t>
+      </w:r>
+      <w:r>
+        <w:rPr>
+          <w:rFonts w:cs="Arial"/>
+          <w:sz w:val="16"/>
+          <w:szCs w:val="16"/>
+          <w:lang w:eastAsia="de-DE"/>
+        </w:rPr>
+        <w:t>4557</w:t>
+      </w:r>
+      <w:r>
+        <w:rPr>
+          <w:rFonts w:cs="Arial"/>
+          <w:sz w:val="16"/>
+          <w:szCs w:val="16"/>
+          <w:lang w:eastAsia="de-DE"/>
+        </w:rPr>
+        <w:t>.</w:t>
       </w:r>
     </w:p>
   </w:footnote>
@@ -10527,53 +10973,47 @@
           <w:sz w:val="16"/>
           <w:szCs w:val="16"/>
         </w:rPr>
-        <w:t>Bericht vom 29. April 2020 über die Gesamterneuerung der ausserparlamentarischen Kommissionen, Leitungsorgane und Vertretungen des Bundes durch den Bundesrat für die Amtsperiode 2020–2023</w:t>
+        <w:t xml:space="preserve">Nicht berücksichtigt sind die </w:t>
       </w:r>
       <w:r>
         <w:rPr>
           <w:rFonts w:cs="Arial"/>
           <w:sz w:val="16"/>
           <w:szCs w:val="16"/>
-          <w:lang w:eastAsia="de-DE"/>
-        </w:rPr>
-        <w:t xml:space="preserve">; BBl </w:t>
-      </w:r>
-      <w:r>
-        <w:rPr>
-          <w:rFonts w:cs="Arial"/>
-          <w:i/>
+        </w:rPr>
+        <w:t>&lt;&lt;[informationNote.</w:t>
+      </w:r>
+      <w:r>
+        <w:rPr>
+          <w:rFonts w:cs="Arial"/>
           <w:sz w:val="16"/>
           <w:szCs w:val="16"/>
-          <w:lang w:eastAsia="de-DE"/>
-        </w:rPr>
-        <w:t>2020</w:t>
+        </w:rPr>
+        <w:t>u</w:t>
       </w:r>
       <w:r>
         <w:rPr>
           <w:rFonts w:cs="Arial"/>
           <w:sz w:val="16"/>
           <w:szCs w:val="16"/>
-          <w:lang w:eastAsia="de-DE"/>
-        </w:rPr>
-        <w:t xml:space="preserve"> 4549 S. </w:t>
+        </w:rPr>
+        <w:t>nreleasedExtraParliamentaryCommittees</w:t>
       </w:r>
       <w:r>
         <w:rPr>
           <w:rFonts w:cs="Arial"/>
           <w:sz w:val="16"/>
           <w:szCs w:val="16"/>
-          <w:lang w:eastAsia="de-DE"/>
-        </w:rPr>
-        <w:t>4557</w:t>
+        </w:rPr>
+        <w:t>]&gt;&gt;</w:t>
       </w:r>
       <w:r>
         <w:rPr>
           <w:rFonts w:cs="Arial"/>
           <w:sz w:val="16"/>
           <w:szCs w:val="16"/>
-          <w:lang w:eastAsia="de-DE"/>
-        </w:rPr>
-        <w:t>.</w:t>
+        </w:rPr>
+        <w:t xml:space="preserve"> Kommissionen, welche noch nicht für die Gesamterneuerungswahlen freigegeben wurden.</w:t>
       </w:r>
     </w:p>
   </w:footnote>
@@ -10681,47 +11121,53 @@
           <w:sz w:val="16"/>
           <w:szCs w:val="16"/>
         </w:rPr>
-        <w:t xml:space="preserve">Nicht berücksichtigt sind die </w:t>
+        <w:t>Bericht vom 29. April 2020 über die Gesamterneuerung der ausserparlamentarischen Kommissionen, Leitungsorgane und Vertretungen des Bundes durch den Bundesrat für die Amtsperiode 2020–2023</w:t>
       </w:r>
       <w:r>
         <w:rPr>
           <w:rFonts w:cs="Arial"/>
           <w:sz w:val="16"/>
           <w:szCs w:val="16"/>
-        </w:rPr>
-        <w:t>&lt;&lt;[informationNote.</w:t>
-      </w:r>
-      <w:r>
-        <w:rPr>
-          <w:rFonts w:cs="Arial"/>
+          <w:lang w:eastAsia="de-DE"/>
+        </w:rPr>
+        <w:t xml:space="preserve">; BBl </w:t>
+      </w:r>
+      <w:r>
+        <w:rPr>
+          <w:rFonts w:cs="Arial"/>
+          <w:i/>
           <w:sz w:val="16"/>
           <w:szCs w:val="16"/>
-        </w:rPr>
-        <w:t>u</w:t>
+          <w:lang w:eastAsia="de-DE"/>
+        </w:rPr>
+        <w:t>2020</w:t>
       </w:r>
       <w:r>
         <w:rPr>
           <w:rFonts w:cs="Arial"/>
           <w:sz w:val="16"/>
           <w:szCs w:val="16"/>
-        </w:rPr>
-        <w:t>nreleasedExtraParliamentaryCommittees</w:t>
+          <w:lang w:eastAsia="de-DE"/>
+        </w:rPr>
+        <w:t xml:space="preserve"> 4549 S. </w:t>
       </w:r>
       <w:r>
         <w:rPr>
           <w:rFonts w:cs="Arial"/>
           <w:sz w:val="16"/>
           <w:szCs w:val="16"/>
-        </w:rPr>
-        <w:t>]&gt;&gt;</w:t>
+          <w:lang w:eastAsia="de-DE"/>
+        </w:rPr>
+        <w:t>4558</w:t>
       </w:r>
       <w:r>
         <w:rPr>
           <w:rFonts w:cs="Arial"/>
           <w:sz w:val="16"/>
           <w:szCs w:val="16"/>
-        </w:rPr>
-        <w:t xml:space="preserve"> Kommissionen, welche noch nicht für die Gesamterneuerungswahlen freigegeben wurden.</w:t>
+          <w:lang w:eastAsia="de-DE"/>
+        </w:rPr>
+        <w:t>.</w:t>
       </w:r>
     </w:p>
   </w:footnote>
@@ -10744,6 +11190,10 @@
         <w:footnoteRef/>
       </w:r>
       <w:r>
+        <w:rPr>
+          <w:rStyle w:val="Funotenzeichen"/>
+          <w:rFonts w:eastAsiaTheme="minorHAnsi"/>
+        </w:rPr>
         <w:t xml:space="preserve"> </w:t>
       </w:r>
       <w:r>
@@ -10754,13 +11204,79 @@
           <w:rFonts w:cs="Arial"/>
           <w:sz w:val="16"/>
           <w:szCs w:val="16"/>
-          <w:lang w:eastAsia="de-DE"/>
-        </w:rPr>
-        <w:t>Da noch Wahlanträge ausstehend sind, lassen sich noch keine definitiven Schlüsse ziehen.</w:t>
+        </w:rPr>
+        <w:t>Art. 8</w:t>
+      </w:r>
+      <w:r>
+        <w:rPr>
+          <w:rFonts w:cs="Arial"/>
+          <w:i/>
+          <w:sz w:val="16"/>
+          <w:szCs w:val="16"/>
+        </w:rPr>
+        <w:t>i</w:t>
+      </w:r>
+      <w:r>
+        <w:rPr>
+          <w:rFonts w:cs="Arial"/>
+          <w:sz w:val="16"/>
+          <w:szCs w:val="16"/>
+        </w:rPr>
+        <w:t xml:space="preserve"> Abs. 1 und 2 RVOV</w:t>
       </w:r>
     </w:p>
   </w:footnote>
   <w:footnote w:id="9">
+    <w:p>
+      <w:pPr>
+        <w:pStyle w:val="Funotentext"/>
+        <w:tabs>
+          <w:tab w:val="left" w:pos="284"/>
+        </w:tabs>
+      </w:pPr>
+      <w:r>
+        <w:rPr>
+          <w:rStyle w:val="Funotenzeichen"/>
+          <w:rFonts w:eastAsiaTheme="minorHAnsi" w:cs="Arial"/>
+          <w:sz w:val="16"/>
+          <w:szCs w:val="16"/>
+        </w:rPr>
+        <w:footnoteRef/>
+      </w:r>
+      <w:r>
+        <w:t xml:space="preserve"> </w:t>
+      </w:r>
+      <w:r>
+        <w:tab/>
+      </w:r>
+      <w:r>
+        <w:rPr>
+          <w:rFonts w:cs="Arial"/>
+          <w:sz w:val="16"/>
+          <w:szCs w:val="16"/>
+        </w:rPr>
+        <w:t>Art. 8</w:t>
+      </w:r>
+      <w:r>
+        <w:rPr>
+          <w:rFonts w:cs="Arial"/>
+          <w:i/>
+          <w:sz w:val="16"/>
+          <w:szCs w:val="16"/>
+        </w:rPr>
+        <w:t>i</w:t>
+      </w:r>
+      <w:r>
+        <w:rPr>
+          <w:rFonts w:cs="Arial"/>
+          <w:sz w:val="16"/>
+          <w:szCs w:val="16"/>
+        </w:rPr>
+        <w:t xml:space="preserve"> Abs. 3 RVOV</w:t>
+      </w:r>
+    </w:p>
+  </w:footnote>
+  <w:footnote w:id="10">
     <w:p>
       <w:pPr>
         <w:pStyle w:val="Funotentext"/>
@@ -10779,68 +11295,171 @@
         <w:footnoteRef/>
       </w:r>
       <w:r>
-        <w:t xml:space="preserve"> </w:t>
-      </w:r>
-      <w:r>
-        <w:tab/>
-      </w:r>
-      <w:r>
-        <w:rPr>
-          <w:rFonts w:cs="Arial"/>
+        <w:rPr>
+          <w:rStyle w:val="Funotenzeichen"/>
+          <w:rFonts w:eastAsiaTheme="minorHAnsi" w:cs="Arial"/>
           <w:sz w:val="16"/>
           <w:szCs w:val="16"/>
         </w:rPr>
-        <w:t>Bericht vom 29. April 2020 über die Gesamterneuerung der ausserparlamentarischen Kommissionen, Leitungsorgane und Vertretungen des Bundes durch den Bundesrat für die Amtsperiode 2020–2023</w:t>
+        <w:t xml:space="preserve"> </w:t>
+      </w:r>
+      <w:r>
+        <w:tab/>
       </w:r>
       <w:r>
         <w:rPr>
           <w:rFonts w:cs="Arial"/>
           <w:sz w:val="16"/>
           <w:szCs w:val="16"/>
-          <w:lang w:eastAsia="de-DE"/>
-        </w:rPr>
-        <w:t xml:space="preserve">; BBl </w:t>
-      </w:r>
-      <w:r>
-        <w:rPr>
-          <w:rFonts w:cs="Arial"/>
-          <w:i/>
+        </w:rPr>
+        <w:t xml:space="preserve">Nicht berücksichtigt sind die </w:t>
+      </w:r>
+      <w:r>
+        <w:rPr>
+          <w:rFonts w:cs="Arial"/>
           <w:sz w:val="16"/>
           <w:szCs w:val="16"/>
-          <w:lang w:eastAsia="de-DE"/>
-        </w:rPr>
-        <w:t>2020</w:t>
+        </w:rPr>
+        <w:t>&lt;&lt;[informationNote.</w:t>
       </w:r>
       <w:r>
         <w:rPr>
           <w:rFonts w:cs="Arial"/>
           <w:sz w:val="16"/>
           <w:szCs w:val="16"/>
-          <w:lang w:eastAsia="de-DE"/>
-        </w:rPr>
-        <w:t xml:space="preserve"> 4549 S. </w:t>
+        </w:rPr>
+        <w:t>unreleased</w:t>
       </w:r>
       <w:r>
         <w:rPr>
           <w:rFonts w:cs="Arial"/>
           <w:sz w:val="16"/>
           <w:szCs w:val="16"/>
-          <w:lang w:eastAsia="de-DE"/>
-        </w:rPr>
-        <w:t>4558</w:t>
+        </w:rPr>
+        <w:t>ExtraParliamentary</w:t>
       </w:r>
       <w:r>
         <w:rPr>
           <w:rFonts w:cs="Arial"/>
           <w:sz w:val="16"/>
           <w:szCs w:val="16"/>
-          <w:lang w:eastAsia="de-DE"/>
-        </w:rPr>
-        <w:t>.</w:t>
+        </w:rPr>
+        <w:t>Committees]&gt;&gt;</w:t>
+      </w:r>
+      <w:r>
+        <w:rPr>
+          <w:rFonts w:cs="Arial"/>
+          <w:sz w:val="16"/>
+          <w:szCs w:val="16"/>
+        </w:rPr>
+        <w:t xml:space="preserve"> Kommissionen, welche noch nicht für die Gesamterneuerungswahlen freigegeben wurden.</w:t>
       </w:r>
     </w:p>
   </w:footnote>
-  <w:footnote w:id="10">
+  <w:footnote w:id="11">
+    <w:p>
+      <w:pPr>
+        <w:pStyle w:val="Funotentext"/>
+        <w:ind w:left="284" w:hanging="284"/>
+      </w:pPr>
+      <w:r>
+        <w:rPr>
+          <w:rStyle w:val="Funotenzeichen"/>
+          <w:rFonts w:eastAsiaTheme="minorHAnsi" w:cs="Arial"/>
+          <w:sz w:val="16"/>
+          <w:szCs w:val="16"/>
+        </w:rPr>
+        <w:footnoteRef/>
+      </w:r>
+      <w:r>
+        <w:t xml:space="preserve"> </w:t>
+      </w:r>
+      <w:r>
+        <w:tab/>
+      </w:r>
+      <w:r>
+        <w:rPr>
+          <w:rFonts w:cs="Arial"/>
+          <w:sz w:val="16"/>
+          <w:szCs w:val="16"/>
+        </w:rPr>
+        <w:t xml:space="preserve">Nicht berücksichtigt </w:t>
+      </w:r>
+      <w:r>
+        <w:rPr>
+          <w:rFonts w:cs="Arial"/>
+          <w:sz w:val="16"/>
+          <w:szCs w:val="16"/>
+        </w:rPr>
+        <w:t>sind die</w:t>
+      </w:r>
+      <w:r>
+        <w:rPr>
+          <w:rFonts w:cs="Arial"/>
+          <w:sz w:val="16"/>
+          <w:szCs w:val="16"/>
+        </w:rPr>
+        <w:t xml:space="preserve"> &lt;&lt;[informationNote.</w:t>
+      </w:r>
+      <w:r>
+        <w:rPr>
+          <w:rFonts w:cs="Arial"/>
+          <w:sz w:val="16"/>
+          <w:szCs w:val="16"/>
+        </w:rPr>
+        <w:t>totalU</w:t>
+      </w:r>
+      <w:r>
+        <w:rPr>
+          <w:rFonts w:cs="Arial"/>
+          <w:sz w:val="16"/>
+          <w:szCs w:val="16"/>
+        </w:rPr>
+        <w:t>nvalidatedNonExtraParliamentCommittees]&gt;&gt;</w:t>
+      </w:r>
+      <w:r>
+        <w:rPr>
+          <w:rFonts w:cs="Arial"/>
+          <w:sz w:val="16"/>
+          <w:szCs w:val="16"/>
+        </w:rPr>
+        <w:t xml:space="preserve"> Leitungsorga</w:t>
+      </w:r>
+      <w:r>
+        <w:rPr>
+          <w:rFonts w:cs="Arial"/>
+          <w:sz w:val="16"/>
+          <w:szCs w:val="16"/>
+        </w:rPr>
+        <w:t>ne</w:t>
+      </w:r>
+      <w:r>
+        <w:rPr>
+          <w:rFonts w:cs="Arial"/>
+          <w:sz w:val="16"/>
+          <w:szCs w:val="16"/>
+        </w:rPr>
+        <w:t xml:space="preserve"> oder Vertretungen des Bundes</w:t>
+      </w:r>
+      <w:r>
+        <w:rPr>
+          <w:rFonts w:cs="Arial"/>
+          <w:sz w:val="16"/>
+          <w:szCs w:val="16"/>
+        </w:rPr>
+        <w:t xml:space="preserve">, welche noch </w:t>
+      </w:r>
+      <w:r>
+        <w:rPr>
+          <w:rFonts w:cs="Arial"/>
+          <w:sz w:val="16"/>
+          <w:szCs w:val="16"/>
+        </w:rPr>
+        <w:t>keinen validierten Wahlvorschlag haben.</w:t>
+      </w:r>
+    </w:p>
+  </w:footnote>
+  <w:footnote w:id="12">
     <w:p>
       <w:pPr>
         <w:pStyle w:val="Funotentext"/>
@@ -10861,58 +11480,10 @@
       <w:r>
         <w:rPr>
           <w:rStyle w:val="Funotenzeichen"/>
-          <w:rFonts w:eastAsiaTheme="minorHAnsi"/>
-        </w:rPr>
-        <w:t xml:space="preserve"> </w:t>
-      </w:r>
-      <w:r>
-        <w:tab/>
-      </w:r>
-      <w:r>
-        <w:rPr>
-          <w:rFonts w:cs="Arial"/>
-          <w:sz w:val="16"/>
-          <w:szCs w:val="16"/>
-        </w:rPr>
-        <w:t>Art. 8</w:t>
-      </w:r>
-      <w:r>
-        <w:rPr>
-          <w:rFonts w:cs="Arial"/>
-          <w:i/>
-          <w:sz w:val="16"/>
-          <w:szCs w:val="16"/>
-        </w:rPr>
-        <w:t>i</w:t>
-      </w:r>
-      <w:r>
-        <w:rPr>
-          <w:rFonts w:cs="Arial"/>
-          <w:sz w:val="16"/>
-          <w:szCs w:val="16"/>
-        </w:rPr>
-        <w:t xml:space="preserve"> Abs. 1 und 2 RVOV</w:t>
-      </w:r>
-    </w:p>
-  </w:footnote>
-  <w:footnote w:id="11">
-    <w:p>
-      <w:pPr>
-        <w:pStyle w:val="Funotentext"/>
-        <w:tabs>
-          <w:tab w:val="left" w:pos="284"/>
-        </w:tabs>
-      </w:pPr>
-      <w:r>
-        <w:rPr>
-          <w:rStyle w:val="Funotenzeichen"/>
           <w:rFonts w:eastAsiaTheme="minorHAnsi" w:cs="Arial"/>
           <w:sz w:val="16"/>
           <w:szCs w:val="16"/>
         </w:rPr>
-        <w:footnoteRef/>
-      </w:r>
-      <w:r>
         <w:t xml:space="preserve"> </w:t>
       </w:r>
       <w:r>
@@ -10924,16 +11495,15 @@
           <w:sz w:val="16"/>
           <w:szCs w:val="16"/>
         </w:rPr>
-        <w:t>Art. 8</w:t>
-      </w:r>
-      <w:r>
-        <w:rPr>
-          <w:rFonts w:cs="Arial"/>
-          <w:i/>
+        <w:t>Es</w:t>
+      </w:r>
+      <w:r>
+        <w:rPr>
+          <w:rFonts w:cs="Arial"/>
           <w:sz w:val="16"/>
           <w:szCs w:val="16"/>
         </w:rPr>
-        <w:t>i</w:t>
+        <w:t xml:space="preserve"> werden alle Personen aufgeführt, die im Rahmen der Gesamterneuerungswahlen für drei oder mehr Mitgliedschaften vorgesehen sind. Es werden nur Gremien </w:t>
       </w:r>
       <w:r>
         <w:rPr>
@@ -10941,232 +11511,15 @@
           <w:sz w:val="16"/>
           <w:szCs w:val="16"/>
         </w:rPr>
-        <w:t xml:space="preserve"> Abs. 3 RVOV</w:t>
-      </w:r>
-    </w:p>
-  </w:footnote>
-  <w:footnote w:id="12">
-    <w:p>
-      <w:pPr>
-        <w:pStyle w:val="Funotentext"/>
-        <w:tabs>
-          <w:tab w:val="left" w:pos="284"/>
-        </w:tabs>
-        <w:ind w:left="284" w:hanging="284"/>
-      </w:pPr>
-      <w:r>
-        <w:rPr>
-          <w:rStyle w:val="Funotenzeichen"/>
-          <w:rFonts w:eastAsiaTheme="minorHAnsi" w:cs="Arial"/>
+        <w:t xml:space="preserve">mit validierten Wahlvorschlägen </w:t>
+      </w:r>
+      <w:r>
+        <w:rPr>
+          <w:rFonts w:cs="Arial"/>
           <w:sz w:val="16"/>
           <w:szCs w:val="16"/>
         </w:rPr>
-        <w:footnoteRef/>
-      </w:r>
-      <w:r>
-        <w:rPr>
-          <w:rStyle w:val="Funotenzeichen"/>
-          <w:rFonts w:eastAsiaTheme="minorHAnsi" w:cs="Arial"/>
-          <w:sz w:val="16"/>
-          <w:szCs w:val="16"/>
-        </w:rPr>
-        <w:t xml:space="preserve"> </w:t>
-      </w:r>
-      <w:r>
-        <w:tab/>
-      </w:r>
-      <w:r>
-        <w:rPr>
-          <w:rFonts w:cs="Arial"/>
-          <w:sz w:val="16"/>
-          <w:szCs w:val="16"/>
-        </w:rPr>
-        <w:t xml:space="preserve">Nicht berücksichtigt sind die </w:t>
-      </w:r>
-      <w:r>
-        <w:rPr>
-          <w:rFonts w:cs="Arial"/>
-          <w:sz w:val="16"/>
-          <w:szCs w:val="16"/>
-        </w:rPr>
-        <w:t>&lt;&lt;[informationNote.</w:t>
-      </w:r>
-      <w:r>
-        <w:rPr>
-          <w:rFonts w:cs="Arial"/>
-          <w:sz w:val="16"/>
-          <w:szCs w:val="16"/>
-        </w:rPr>
-        <w:t>unreleased</w:t>
-      </w:r>
-      <w:r>
-        <w:rPr>
-          <w:rFonts w:cs="Arial"/>
-          <w:sz w:val="16"/>
-          <w:szCs w:val="16"/>
-        </w:rPr>
-        <w:t>ExtraParliamentary</w:t>
-      </w:r>
-      <w:r>
-        <w:rPr>
-          <w:rFonts w:cs="Arial"/>
-          <w:sz w:val="16"/>
-          <w:szCs w:val="16"/>
-        </w:rPr>
-        <w:t>Committees]&gt;&gt;</w:t>
-      </w:r>
-      <w:r>
-        <w:rPr>
-          <w:rFonts w:cs="Arial"/>
-          <w:sz w:val="16"/>
-          <w:szCs w:val="16"/>
-        </w:rPr>
-        <w:t xml:space="preserve"> Kommissionen, welche noch nicht für die Gesamterneuerungswahlen freigegeben wurden.</w:t>
-      </w:r>
-    </w:p>
-  </w:footnote>
-  <w:footnote w:id="13">
-    <w:p>
-      <w:pPr>
-        <w:pStyle w:val="Funotentext"/>
-        <w:tabs>
-          <w:tab w:val="left" w:pos="284"/>
-        </w:tabs>
-        <w:ind w:left="284" w:hanging="284"/>
-      </w:pPr>
-      <w:r>
-        <w:rPr>
-          <w:rStyle w:val="Funotenzeichen"/>
-          <w:rFonts w:eastAsiaTheme="minorHAnsi" w:cs="Arial"/>
-          <w:sz w:val="16"/>
-          <w:szCs w:val="16"/>
-        </w:rPr>
-        <w:footnoteRef/>
-      </w:r>
-      <w:r>
-        <w:t xml:space="preserve"> </w:t>
-      </w:r>
-      <w:r>
-        <w:tab/>
-      </w:r>
-      <w:r>
-        <w:rPr>
-          <w:rFonts w:cs="Arial"/>
-          <w:sz w:val="16"/>
-          <w:szCs w:val="16"/>
-        </w:rPr>
-        <w:t xml:space="preserve">Nicht berücksichtigt sind die </w:t>
-      </w:r>
-      <w:r>
-        <w:rPr>
-          <w:rFonts w:cs="Arial"/>
-          <w:sz w:val="16"/>
-          <w:szCs w:val="16"/>
-        </w:rPr>
-        <w:t>&lt;&lt;[informationNote.</w:t>
-      </w:r>
-      <w:r>
-        <w:rPr>
-          <w:rFonts w:cs="Arial"/>
-          <w:sz w:val="16"/>
-          <w:szCs w:val="16"/>
-        </w:rPr>
-        <w:t>unreleased</w:t>
-      </w:r>
-      <w:r>
-        <w:rPr>
-          <w:rFonts w:cs="Arial"/>
-          <w:sz w:val="16"/>
-          <w:szCs w:val="16"/>
-        </w:rPr>
-        <w:t>ManagementCommittees]&gt;&gt;</w:t>
-      </w:r>
-      <w:r>
-        <w:rPr>
-          <w:rFonts w:cs="Arial"/>
-          <w:sz w:val="16"/>
-          <w:szCs w:val="16"/>
-        </w:rPr>
-        <w:t xml:space="preserve"> Leitungsorgane, welche noch nicht für die Gesamterneuerungswahlen freigegeben wurden.</w:t>
-      </w:r>
-    </w:p>
-  </w:footnote>
-  <w:footnote w:id="14">
-    <w:p>
-      <w:pPr>
-        <w:pStyle w:val="Funotentext"/>
-        <w:ind w:left="284" w:hanging="284"/>
-      </w:pPr>
-      <w:r>
-        <w:rPr>
-          <w:rStyle w:val="Funotenzeichen"/>
-          <w:rFonts w:eastAsiaTheme="minorHAnsi" w:cs="Arial"/>
-          <w:sz w:val="16"/>
-          <w:szCs w:val="16"/>
-        </w:rPr>
-        <w:footnoteRef/>
-      </w:r>
-      <w:r>
-        <w:t xml:space="preserve"> </w:t>
-      </w:r>
-      <w:r>
-        <w:tab/>
-      </w:r>
-      <w:r>
-        <w:rPr>
-          <w:rFonts w:cs="Arial"/>
-          <w:sz w:val="16"/>
-          <w:szCs w:val="16"/>
-        </w:rPr>
-        <w:t>Nicht berücksichtigt sind die 4 Leitungsorgane, welche noch nicht für die Gesamterneuerungswahlen freigegeben wurden.</w:t>
-      </w:r>
-    </w:p>
-  </w:footnote>
-  <w:footnote w:id="15">
-    <w:p>
-      <w:pPr>
-        <w:pStyle w:val="Funotentext"/>
-        <w:tabs>
-          <w:tab w:val="left" w:pos="284"/>
-        </w:tabs>
-        <w:ind w:left="284" w:hanging="284"/>
-      </w:pPr>
-      <w:r>
-        <w:rPr>
-          <w:rStyle w:val="Funotenzeichen"/>
-          <w:rFonts w:eastAsiaTheme="minorHAnsi" w:cs="Arial"/>
-          <w:sz w:val="16"/>
-          <w:szCs w:val="16"/>
-        </w:rPr>
-        <w:footnoteRef/>
-      </w:r>
-      <w:r>
-        <w:rPr>
-          <w:rStyle w:val="Funotenzeichen"/>
-          <w:rFonts w:eastAsiaTheme="minorHAnsi" w:cs="Arial"/>
-          <w:sz w:val="16"/>
-          <w:szCs w:val="16"/>
-        </w:rPr>
-        <w:t xml:space="preserve"> </w:t>
-      </w:r>
-      <w:r>
-        <w:tab/>
-      </w:r>
-      <w:r>
-        <w:rPr>
-          <w:rFonts w:cs="Arial"/>
-          <w:sz w:val="16"/>
-          <w:szCs w:val="16"/>
-        </w:rPr>
-        <w:t>Es</w:t>
-      </w:r>
-      <w:r>
-        <w:rPr>
-          <w:rFonts w:cs="Arial"/>
-          <w:sz w:val="16"/>
-          <w:szCs w:val="16"/>
-        </w:rPr>
-        <w:t xml:space="preserve"> werden alle Personen aufgeführt, die im Rahmen der Gesamterneuerungswahlen für drei oder mehr Mitgliedschaften vorgesehen sind. Es werden nur Gremien berücksichtigt, die für die Gesamterneuerungswahl freigegeben wurden.</w:t>
+        <w:t>berücksichtigt.</w:t>
       </w:r>
     </w:p>
   </w:footnote>
@@ -11782,7 +12135,6 @@
     <w:lvl w:ilvl="1">
       <w:start w:val="1"/>
       <w:numFmt w:val="decimal"/>
-      <w:pStyle w:val="berschrift2"/>
       <w:lvlText w:val="%1.%2"/>
       <w:lvlJc w:val="left"/>
       <w:pPr>
@@ -14002,12 +14354,9 @@
     <w:link w:val="berschrift2Zchn"/>
     <w:autoRedefine/>
     <w:qFormat/>
+    <w:rsid w:val="00672314"/>
     <w:pPr>
       <w:keepNext/>
-      <w:numPr>
-        <w:ilvl w:val="1"/>
-        <w:numId w:val="3"/>
-      </w:numPr>
       <w:spacing w:line="340" w:lineRule="exact"/>
       <w:outlineLvl w:val="1"/>
     </w:pPr>
@@ -14212,7 +14561,6 @@
   <w:style w:type="character" w:default="1" w:styleId="Absatz-Standardschriftart">
     <w:name w:val="Default Paragraph Font"/>
     <w:uiPriority w:val="1"/>
-    <w:semiHidden/>
     <w:unhideWhenUsed/>
   </w:style>
   <w:style w:type="table" w:default="1" w:styleId="NormaleTabelle">
@@ -15009,7 +15357,7 @@
     <w:name w:val="Überschrift 2 Zchn"/>
     <w:basedOn w:val="Absatz-Standardschriftart"/>
     <w:link w:val="berschrift2"/>
-    <w:rsid w:val="00E91B27"/>
+    <w:rsid w:val="00672314"/>
     <w:rPr>
       <w:rFonts w:ascii="Arial" w:hAnsi="Arial" w:cs="Arial"/>
       <w:b/>
@@ -17242,6 +17590,26 @@
       <w:sz w:val="24"/>
       <w:szCs w:val="24"/>
       <w:lang w:val="en-US" w:eastAsia="en-US"/>
+    </w:rPr>
+  </w:style>
+  <w:style w:type="paragraph" w:styleId="HTMLVorformatiert">
+    <w:name w:val="HTML Preformatted"/>
+    <w:basedOn w:val="Standard"/>
+    <w:link w:val="HTMLVorformatiertZchn"/>
+    <w:rsid w:val="00D54E5E"/>
+    <w:rPr>
+      <w:rFonts w:ascii="Consolas" w:hAnsi="Consolas"/>
+      <w:sz w:val="20"/>
+    </w:rPr>
+  </w:style>
+  <w:style w:type="character" w:customStyle="1" w:styleId="HTMLVorformatiertZchn">
+    <w:name w:val="HTML Vorformatiert Zchn"/>
+    <w:basedOn w:val="Absatz-Standardschriftart"/>
+    <w:link w:val="HTMLVorformatiert"/>
+    <w:rsid w:val="00D54E5E"/>
+    <w:rPr>
+      <w:rFonts w:ascii="Consolas" w:hAnsi="Consolas"/>
+      <w:lang w:val="de-CH" w:eastAsia="de-CH"/>
     </w:rPr>
   </w:style>
 </w:styles>

</xml_diff>

<commit_message>
feat: fix italian jobs, update information note template #BKDO-4271
</commit_message>
<xml_diff>
--- a/src/Bk.APG.Api/Templates/InformationNote_German.docx
+++ b/src/Bk.APG.Api/Templates/InformationNote_German.docx
@@ -520,61 +520,7 @@
         <w:rPr>
           <w:rFonts w:cs="Arial"/>
         </w:rPr>
-        <w:t xml:space="preserve"> </w:t>
-      </w:r>
-      <w:r>
-        <w:rPr>
-          <w:rFonts w:cs="Arial"/>
-        </w:rPr>
-        <w:t>Anhang 1</w:t>
-      </w:r>
-      <w:r>
-        <w:rPr>
-          <w:rFonts w:cs="Arial"/>
-        </w:rPr>
-        <w:t>b</w:t>
-      </w:r>
-      <w:r>
-        <w:rPr>
-          <w:rFonts w:cs="Arial"/>
-        </w:rPr>
-        <w:t xml:space="preserve"> </w:t>
-      </w:r>
-      <w:r>
-        <w:rPr>
-          <w:rFonts w:cs="Arial"/>
-        </w:rPr>
-        <w:t xml:space="preserve">listet die </w:t>
-      </w:r>
-      <w:r>
-        <w:rPr>
-          <w:rFonts w:cs="Arial"/>
-        </w:rPr>
-        <w:t xml:space="preserve">Gremien auf, welche </w:t>
-      </w:r>
-      <w:r>
-        <w:rPr>
-          <w:rFonts w:cs="Arial"/>
-        </w:rPr>
-        <w:t xml:space="preserve">noch offene </w:t>
-      </w:r>
-      <w:r>
-        <w:rPr>
-          <w:rFonts w:cs="Arial"/>
-        </w:rPr>
-        <w:t xml:space="preserve">Wahlvorschläge </w:t>
-      </w:r>
-      <w:r>
-        <w:rPr>
-          <w:rFonts w:cs="Arial"/>
-        </w:rPr>
-        <w:t>haben</w:t>
-      </w:r>
-      <w:r>
-        <w:rPr>
-          <w:rFonts w:cs="Arial"/>
-        </w:rPr>
-        <w:t>.</w:t>
+        <w:t xml:space="preserve"> Anhang 1b listet die Gremien auf, welche noch offene Wahlvorschläge haben.</w:t>
       </w:r>
       <w:r>
         <w:rPr>
@@ -1521,7 +1467,19 @@
         <w:rPr>
           <w:rFonts w:cs="Arial"/>
         </w:rPr>
-        <w:t xml:space="preserve"> mit Vakanzen im Vahlvorschlag validiert.</w:t>
+        <w:t xml:space="preserve"> mit Vakanzen im </w:t>
+      </w:r>
+      <w:r>
+        <w:rPr>
+          <w:rFonts w:cs="Arial"/>
+        </w:rPr>
+        <w:t>W</w:t>
+      </w:r>
+      <w:r>
+        <w:rPr>
+          <w:rFonts w:cs="Arial"/>
+        </w:rPr>
+        <w:t>ahlvorschlag validiert.</w:t>
       </w:r>
     </w:p>
     <w:p>

</xml_diff>